<commit_message>
Conform to the Microbial Genomics article outline and author guidance
</commit_message>
<xml_diff>
--- a/docs/preprint/manuscript.docx
+++ b/docs/preprint/manuscript.docx
@@ -41,6 +41,14 @@
       </w:pPr>
       <w:r>
         <w:t xml:space="preserve">Department of Computer Science and Engineering, University of Rajshahi, Rajshahi 6205, Bangladesh</w:t>
+      </w:r>
+    </w:p>
+    <w:p>
+      <w:pPr>
+        <w:pStyle w:val="BodyText"/>
+      </w:pPr>
+      <w:r>
+        <w:t xml:space="preserve">ORCID: Md Omar Faruqe, 0000-0002-1226-7226; Md Humayun Kabir, 0000-0002-2640-2361</w:t>
       </w:r>
     </w:p>
     <w:p>
@@ -192,7 +200,7 @@
         <w:t xml:space="preserve"> </w:t>
       </w:r>
       <w:r>
-        <w:t xml:space="preserve">results, re-interpreted every minimum inhibitory concentration under one standard (EUCAST v16.1),</w:t>
+        <w:t xml:space="preserve">results, re-interpreted every minimum inhibitory concentration under one standard (European Committee on Antimicrobial Susceptibility Testing v16.1),</w:t>
       </w:r>
       <w:r>
         <w:t xml:space="preserve"> </w:t>
@@ -231,7 +239,7 @@
         <w:t xml:space="preserve"> </w:t>
       </w:r>
       <w:r>
-        <w:t xml:space="preserve">from NCBI Pathogen Detection.</w:t>
+        <w:t xml:space="preserve">from the National Center for Biotechnology Information (NCBI) Pathogen Detection database.</w:t>
       </w:r>
     </w:p>
     <w:p>
@@ -296,7 +304,7 @@
         <w:t xml:space="preserve"> </w:t>
       </w:r>
       <w:r>
-        <w:t xml:space="preserve">rule reached 77.8% sensitivity (95% CI 67.6–85.5) at 99.5% specificity, its</w:t>
+        <w:t xml:space="preserve">rule reached 77.8% sensitivity (95% confidence interval 67.6–85.5) at 99.5% specificity, its</w:t>
       </w:r>
       <w:r>
         <w:t xml:space="preserve"> </w:t>
@@ -343,7 +351,7 @@
         <w:t xml:space="preserve"> </w:t>
       </w:r>
       <w:r>
-        <w:t xml:space="preserve">random and study-aware validation conceal. Genomic AMR evaluations should report a</w:t>
+        <w:t xml:space="preserve">random and study-aware validation conceal. Genomic antimicrobial resistance evaluations should report a</w:t>
       </w:r>
       <w:r>
         <w:t xml:space="preserve"> </w:t>
@@ -8252,7 +8260,7 @@
     </a:clrScheme>
     <a:fontScheme name="Office">
       <a:majorFont>
-        <a:latin typeface="Calibri"/>
+        <a:latin typeface="Times New Roman"/>
         <a:ea typeface=""/>
         <a:cs typeface=""/>
         <a:font script="Jpan" typeface="ＭＳ ゴシック"/>
@@ -8286,7 +8294,7 @@
         <a:font script="Uigh" typeface="Microsoft Uighur"/>
       </a:majorFont>
       <a:minorFont>
-        <a:latin typeface="Cambria"/>
+        <a:latin typeface="Times New Roman"/>
         <a:ea typeface=""/>
         <a:cs typeface=""/>
         <a:font script="Jpan" typeface="ＭＳ 明朝"/>

</xml_diff>

<commit_message>
Remove internal process documentation from the manuscript
</commit_message>
<xml_diff>
--- a/docs/preprint/manuscript.docx
+++ b/docs/preprint/manuscript.docx
@@ -525,7 +525,508 @@
         <w:t xml:space="preserve"> </w:t>
       </w:r>
       <w:r>
-        <w:t xml:space="preserve">all versions). A model card is at</w:t>
+        <w:t xml:space="preserve">all versions), and include a model card. Every reported figure and table regenerates</w:t>
+      </w:r>
+      <w:r>
+        <w:t xml:space="preserve"> </w:t>
+      </w:r>
+      <w:r>
+        <w:t xml:space="preserve">deterministically from the documented pipeline for a fixed seed.</w:t>
+      </w:r>
+    </w:p>
+    <w:p>
+      <w:pPr>
+        <w:pStyle w:val="Heading2"/>
+      </w:pPr>
+      <w:bookmarkStart w:id="28" w:name="impact-statement"/>
+      <w:r>
+        <w:t xml:space="preserve">Impact Statement</w:t>
+      </w:r>
+      <w:bookmarkEnd w:id="28"/>
+    </w:p>
+    <w:p>
+      <w:pPr>
+        <w:pStyle w:val="FirstParagraph"/>
+      </w:pPr>
+      <w:r>
+        <w:t xml:space="preserve">Genomic prediction of antimicrobial resistance is routinely evaluated by splitting genomes at</w:t>
+      </w:r>
+      <w:r>
+        <w:t xml:space="preserve"> </w:t>
+      </w:r>
+      <w:r>
+        <w:t xml:space="preserve">random, a design that places near-identical isolates on both sides of the split. This study shows,</w:t>
+      </w:r>
+      <w:r>
+        <w:t xml:space="preserve"> </w:t>
+      </w:r>
+      <w:r>
+        <w:t xml:space="preserve">for one well-defined mechanism, what that design conceals. A targeted check for disruption of</w:t>
+      </w:r>
+      <w:r>
+        <w:t xml:space="preserve"> </w:t>
+      </w:r>
+      <w:r>
+        <w:rPr>
+          <w:i/>
+        </w:rPr>
+        <w:t xml:space="preserve">mgrB</w:t>
+      </w:r>
+      <w:r>
+        <w:t xml:space="preserve"> </w:t>
+      </w:r>
+      <w:r>
+        <w:t xml:space="preserve">— the commonest route to colistin resistance in</w:t>
+      </w:r>
+      <w:r>
+        <w:t xml:space="preserve"> </w:t>
+      </w:r>
+      <w:r>
+        <w:rPr>
+          <w:i/>
+        </w:rPr>
+        <w:t xml:space="preserve">Klebsiella pneumoniae</w:t>
+      </w:r>
+      <w:r>
+        <w:t xml:space="preserve">, and one that</w:t>
+      </w:r>
+      <w:r>
+        <w:t xml:space="preserve"> </w:t>
+      </w:r>
+      <w:r>
+        <w:t xml:space="preserve">short-read assemblies systematically hide — recovers substantial sensitivity that gene screens</w:t>
+      </w:r>
+      <w:r>
+        <w:t xml:space="preserve"> </w:t>
+      </w:r>
+      <w:r>
+        <w:t xml:space="preserve">miss, yet the same unfitted rule varies from 39.5% to 70.6% sensitivity between public</w:t>
+      </w:r>
+      <w:r>
+        <w:t xml:space="preserve"> </w:t>
+      </w:r>
+      <w:r>
+        <w:t xml:space="preserve">collections. Machine-learning models outperform the rule under random splitting and fall below it</w:t>
+      </w:r>
+      <w:r>
+        <w:t xml:space="preserve"> </w:t>
+      </w:r>
+      <w:r>
+        <w:t xml:space="preserve">when lineages are held out. For anyone building or evaluating genomic resistance predictors, three</w:t>
+      </w:r>
+      <w:r>
+        <w:t xml:space="preserve"> </w:t>
+      </w:r>
+      <w:r>
+        <w:t xml:space="preserve">consequences follow: reported performance depends on validation design as much as on method;</w:t>
+      </w:r>
+      <w:r>
+        <w:t xml:space="preserve"> </w:t>
+      </w:r>
+      <w:r>
+        <w:t xml:space="preserve">study-aware and lineage-aware splits do not substitute for one another; and external validation on</w:t>
+      </w:r>
+      <w:r>
+        <w:t xml:space="preserve"> </w:t>
+      </w:r>
+      <w:r>
+        <w:t xml:space="preserve">a de-overlapped collection is achievable from public data.</w:t>
+      </w:r>
+    </w:p>
+    <w:p>
+      <w:pPr>
+        <w:pStyle w:val="Heading2"/>
+      </w:pPr>
+      <w:bookmarkStart w:id="29" w:name="introduction"/>
+      <w:r>
+        <w:t xml:space="preserve">1. Introduction</w:t>
+      </w:r>
+      <w:bookmarkEnd w:id="29"/>
+    </w:p>
+    <w:p>
+      <w:pPr>
+        <w:pStyle w:val="FirstParagraph"/>
+      </w:pPr>
+      <w:r>
+        <w:rPr>
+          <w:i/>
+        </w:rPr>
+        <w:t xml:space="preserve">Klebsiella pneumoniae</w:t>
+      </w:r>
+      <w:r>
+        <w:t xml:space="preserve"> </w:t>
+      </w:r>
+      <w:r>
+        <w:t xml:space="preserve">is among the bacterial pathogens responsible for the greatest number of</w:t>
+      </w:r>
+      <w:r>
+        <w:t xml:space="preserve"> </w:t>
+      </w:r>
+      <w:r>
+        <w:t xml:space="preserve">deaths attributable to antimicrobial resistance worldwide [1]. For most drug–organism</w:t>
+      </w:r>
+      <w:r>
+        <w:t xml:space="preserve"> </w:t>
+      </w:r>
+      <w:r>
+        <w:t xml:space="preserve">combinations in this species, resistance is conferred by acquired genes or well-characterised</w:t>
+      </w:r>
+      <w:r>
+        <w:t xml:space="preserve"> </w:t>
+      </w:r>
+      <w:r>
+        <w:t xml:space="preserve">target mutations, and tools such as AMRFinderPlus [2] and Kleborate [3] detect them reliably.</w:t>
+      </w:r>
+      <w:r>
+        <w:t xml:space="preserve"> </w:t>
+      </w:r>
+      <w:r>
+        <w:t xml:space="preserve">Colistin is the conspicuous exception, and the exception matters: colistin is a last-line agent</w:t>
+      </w:r>
+      <w:r>
+        <w:t xml:space="preserve"> </w:t>
+      </w:r>
+      <w:r>
+        <w:t xml:space="preserve">against carbapenem-resistant isolates [4], and resistance arises predominantly not from an</w:t>
+      </w:r>
+      <w:r>
+        <w:t xml:space="preserve"> </w:t>
+      </w:r>
+      <w:r>
+        <w:t xml:space="preserve">acquired gene but from loss of function of</w:t>
+      </w:r>
+      <w:r>
+        <w:t xml:space="preserve"> </w:t>
+      </w:r>
+      <w:r>
+        <w:rPr>
+          <w:i/>
+        </w:rPr>
+        <w:t xml:space="preserve">mgrB</w:t>
+      </w:r>
+      <w:r>
+        <w:t xml:space="preserve">, a 47-codon chromosomal gene encoding a negative</w:t>
+      </w:r>
+      <w:r>
+        <w:t xml:space="preserve"> </w:t>
+      </w:r>
+      <w:r>
+        <w:t xml:space="preserve">regulator of the PhoPQ two-component system. Loss of MgrB de-represses PhoPQ, modifying lipid A</w:t>
+      </w:r>
+      <w:r>
+        <w:t xml:space="preserve"> </w:t>
+      </w:r>
+      <w:r>
+        <w:t xml:space="preserve">and reducing colistin binding [4,5]. Plasmid-borne</w:t>
+      </w:r>
+      <w:r>
+        <w:t xml:space="preserve"> </w:t>
+      </w:r>
+      <w:r>
+        <w:rPr>
+          <w:i/>
+        </w:rPr>
+        <w:t xml:space="preserve">mcr</w:t>
+      </w:r>
+      <w:r>
+        <w:t xml:space="preserve"> </w:t>
+      </w:r>
+      <w:r>
+        <w:t xml:space="preserve">genes provide an acquired route and are globally disseminated [6], but account for a minority of</w:t>
+      </w:r>
+      <w:r>
+        <w:t xml:space="preserve"> </w:t>
+      </w:r>
+      <w:r>
+        <w:t xml:space="preserve">colistin-resistant</w:t>
+      </w:r>
+      <w:r>
+        <w:t xml:space="preserve"> </w:t>
+      </w:r>
+      <w:r>
+        <w:rPr>
+          <w:i/>
+        </w:rPr>
+        <w:t xml:space="preserve">K. pneumoniae</w:t>
+      </w:r>
+      <w:r>
+        <w:t xml:space="preserve">: in the external cohort of Section 3.10, 9 of 81 resistant isolates</w:t>
+      </w:r>
+      <w:r>
+        <w:t xml:space="preserve"> </w:t>
+      </w:r>
+      <w:r>
+        <w:t xml:space="preserve">carried one.</w:t>
+      </w:r>
+    </w:p>
+    <w:p>
+      <w:pPr>
+        <w:pStyle w:val="BodyText"/>
+      </w:pPr>
+      <w:r>
+        <w:t xml:space="preserve">The commonest route to</w:t>
+      </w:r>
+      <w:r>
+        <w:t xml:space="preserve"> </w:t>
+      </w:r>
+      <w:r>
+        <w:rPr>
+          <w:i/>
+        </w:rPr>
+        <w:t xml:space="preserve">mgrB</w:t>
+      </w:r>
+      <w:r>
+        <w:t xml:space="preserve"> </w:t>
+      </w:r>
+      <w:r>
+        <w:t xml:space="preserve">loss is insertion-sequence (IS) transposition into the gene [5], which</w:t>
+      </w:r>
+      <w:r>
+        <w:t xml:space="preserve"> </w:t>
+      </w:r>
+      <w:r>
+        <w:t xml:space="preserve">creates a specific detection problem. An IS element inserted into a 144-base-pair coding sequence</w:t>
+      </w:r>
+      <w:r>
+        <w:t xml:space="preserve"> </w:t>
+      </w:r>
+      <w:r>
+        <w:t xml:space="preserve">is typically longer than the repeat a short-read assembler can resolve, so the assembly breaks</w:t>
+      </w:r>
+      <w:r>
+        <w:t xml:space="preserve"> </w:t>
+      </w:r>
+      <w:r>
+        <w:t xml:space="preserve">inside</w:t>
+      </w:r>
+      <w:r>
+        <w:t xml:space="preserve"> </w:t>
+      </w:r>
+      <w:r>
+        <w:rPr>
+          <w:i/>
+        </w:rPr>
+        <w:t xml:space="preserve">mgrB</w:t>
+      </w:r>
+      <w:r>
+        <w:t xml:space="preserve">. A gene-presence screen finds no acquired colistin determinant; a point-mutation</w:t>
+      </w:r>
+      <w:r>
+        <w:t xml:space="preserve"> </w:t>
+      </w:r>
+      <w:r>
+        <w:t xml:space="preserve">screen finds no codon change, because the alignment simply ends. The genome appears wild type at</w:t>
+      </w:r>
+      <w:r>
+        <w:t xml:space="preserve"> </w:t>
+      </w:r>
+      <w:r>
+        <w:t xml:space="preserve">the one locus that matters.</w:t>
+      </w:r>
+    </w:p>
+    <w:p>
+      <w:pPr>
+        <w:pStyle w:val="BodyText"/>
+      </w:pPr>
+      <w:r>
+        <w:t xml:space="preserve">Two further issues complicate measuring how well genotype predicts phenotype on public data.</w:t>
+      </w:r>
+      <w:r>
+        <w:t xml:space="preserve"> </w:t>
+      </w:r>
+      <w:r>
+        <w:t xml:space="preserve">Deposited labels mix interpretive standards, so identical MICs can be reported susceptible under</w:t>
+      </w:r>
+      <w:r>
+        <w:t xml:space="preserve"> </w:t>
+      </w:r>
+      <w:r>
+        <w:t xml:space="preserve">one CLSI revision and resistant under EUCAST; colistin is especially exposed, because its</w:t>
+      </w:r>
+      <w:r>
+        <w:t xml:space="preserve"> </w:t>
+      </w:r>
+      <w:r>
+        <w:t xml:space="preserve">susceptibility testing is itself difficult and contested [4], and the resulting noise is easily</w:t>
+      </w:r>
+      <w:r>
+        <w:t xml:space="preserve"> </w:t>
+      </w:r>
+      <w:r>
+        <w:t xml:space="preserve">mistaken for genotype error. And public collections are dominated by outbreak investigations and surveys of</w:t>
+      </w:r>
+      <w:r>
+        <w:t xml:space="preserve"> </w:t>
+      </w:r>
+      <w:r>
+        <w:t xml:space="preserve">high-risk clones, so closely related isolates are abundant and random train/test splitting places</w:t>
+      </w:r>
+      <w:r>
+        <w:t xml:space="preserve"> </w:t>
+      </w:r>
+      <w:r>
+        <w:t xml:space="preserve">near-identical genomes on both sides. Yu and colleagues recently demonstrated across more than</w:t>
+      </w:r>
+      <w:r>
+        <w:t xml:space="preserve"> </w:t>
+      </w:r>
+      <w:r>
+        <w:t xml:space="preserve">24,000 genomes from five species that models trained this way substantially conflate lineage</w:t>
+      </w:r>
+      <w:r>
+        <w:t xml:space="preserve"> </w:t>
+      </w:r>
+      <w:r>
+        <w:t xml:space="preserve">markers with resistance determinants, and recommended comparison against rule-based baselines as</w:t>
+      </w:r>
+      <w:r>
+        <w:t xml:space="preserve"> </w:t>
+      </w:r>
+      <w:r>
+        <w:t xml:space="preserve">future work [7].</w:t>
+      </w:r>
+    </w:p>
+    <w:p>
+      <w:pPr>
+        <w:pStyle w:val="BodyText"/>
+      </w:pPr>
+      <w:r>
+        <w:t xml:space="preserve">Machine learning has been applied to this problem repeatedly, including MIC panel prediction for</w:t>
+      </w:r>
+      <w:r>
+        <w:t xml:space="preserve"> </w:t>
+      </w:r>
+      <w:r>
+        <w:rPr>
+          <w:i/>
+        </w:rPr>
+        <w:t xml:space="preserve">K. pneumoniae</w:t>
+      </w:r>
+      <w:r>
+        <w:t xml:space="preserve"> </w:t>
+      </w:r>
+      <w:r>
+        <w:t xml:space="preserve">[8], and has recently been benchmarked at scale: across 78 species–antibiotic</w:t>
+      </w:r>
+      <w:r>
+        <w:t xml:space="preserve"> </w:t>
+      </w:r>
+      <w:r>
+        <w:t xml:space="preserve">datasets, published predictors reached F1-macro ≥0.9 in 64% of randomly split experiments but only</w:t>
+      </w:r>
+      <w:r>
+        <w:t xml:space="preserve"> </w:t>
+      </w:r>
+      <w:r>
+        <w:t xml:space="preserve">25% when folds were made homology-aware, while a rule-based reference method performed best on the</w:t>
+      </w:r>
+      <w:r>
+        <w:t xml:space="preserve"> </w:t>
+      </w:r>
+      <w:r>
+        <w:t xml:space="preserve">most divergent genomes [9]. What that literature largely lacks is a mechanism-specified rule</w:t>
+      </w:r>
+      <w:r>
+        <w:t xml:space="preserve"> </w:t>
+      </w:r>
+      <w:r>
+        <w:t xml:space="preserve">baseline for a drug whose determinant is known but routinely missed, which is what makes colistin</w:t>
+      </w:r>
+      <w:r>
+        <w:t xml:space="preserve"> </w:t>
+      </w:r>
+      <w:r>
+        <w:t xml:space="preserve">the informative case.</w:t>
+      </w:r>
+    </w:p>
+    <w:p>
+      <w:pPr>
+        <w:pStyle w:val="BodyText"/>
+      </w:pPr>
+      <w:r>
+        <w:t xml:space="preserve">We take that recommendation as the design principle and ask a mechanism-level question: when a</w:t>
+      </w:r>
+      <w:r>
+        <w:t xml:space="preserve"> </w:t>
+      </w:r>
+      <w:r>
+        <w:t xml:space="preserve">resistance determinant is detectable but routinely missed, does supplying it to a rule outperform</w:t>
+      </w:r>
+      <w:r>
+        <w:t xml:space="preserve"> </w:t>
+      </w:r>
+      <w:r>
+        <w:t xml:space="preserve">letting a model find it, and does either transfer to new collections? We assemble a 6,652-genome</w:t>
+      </w:r>
+      <w:r>
+        <w:t xml:space="preserve"> </w:t>
+      </w:r>
+      <w:r>
+        <w:t xml:space="preserve">cohort with harmonised labels, add a targeted</w:t>
+      </w:r>
+      <w:r>
+        <w:t xml:space="preserve"> </w:t>
+      </w:r>
+      <w:r>
+        <w:rPr>
+          <w:i/>
+        </w:rPr>
+        <w:t xml:space="preserve">mgrB</w:t>
+      </w:r>
+      <w:r>
+        <w:t xml:space="preserve"> </w:t>
+      </w:r>
+      <w:r>
+        <w:t xml:space="preserve">check designed around the assembly-break</w:t>
+      </w:r>
+      <w:r>
+        <w:t xml:space="preserve"> </w:t>
+      </w:r>
+      <w:r>
+        <w:t xml:space="preserve">failure mode, and evaluate rules and models under progressively stricter validation.</w:t>
+      </w:r>
+    </w:p>
+    <w:p>
+      <w:pPr>
+        <w:pStyle w:val="Heading2"/>
+      </w:pPr>
+      <w:bookmarkStart w:id="30" w:name="methods"/>
+      <w:r>
+        <w:t xml:space="preserve">2. Methods</w:t>
+      </w:r>
+      <w:bookmarkEnd w:id="30"/>
+    </w:p>
+    <w:p>
+      <w:pPr>
+        <w:pStyle w:val="Heading3"/>
+      </w:pPr>
+      <w:bookmarkStart w:id="31" w:name="cohort-assembly-and-provenance"/>
+      <w:r>
+        <w:t xml:space="preserve">2.1 Cohort assembly and provenance</w:t>
+      </w:r>
+      <w:bookmarkEnd w:id="31"/>
+    </w:p>
+    <w:p>
+      <w:pPr>
+        <w:pStyle w:val="FirstParagraph"/>
+      </w:pPr>
+      <w:r>
+        <w:t xml:space="preserve">All</w:t>
+      </w:r>
+      <w:r>
+        <w:t xml:space="preserve"> </w:t>
+      </w:r>
+      <w:r>
+        <w:rPr>
+          <w:i/>
+        </w:rPr>
+        <w:t xml:space="preserve">K. pneumoniae</w:t>
+      </w:r>
+      <w:r>
+        <w:t xml:space="preserve"> </w:t>
+      </w:r>
+      <w:r>
+        <w:t xml:space="preserve">(taxon 573) AMR phenotype records were downloaded from the BV-BRC</w:t>
       </w:r>
       <w:r>
         <w:t xml:space="preserve"> </w:t>
@@ -534,2002 +1035,1385 @@
         <w:rPr>
           <w:rStyle w:val="VerbatimChar"/>
         </w:rPr>
-        <w:t xml:space="preserve">docs/model-card.md</w:t>
-      </w:r>
-      <w:r>
-        <w:t xml:space="preserve">. Every reported figure and table regenerates</w:t>
-      </w:r>
-      <w:r>
-        <w:t xml:space="preserve"> </w:t>
-      </w:r>
-      <w:r>
-        <w:t xml:space="preserve">deterministically from the documented pipeline for a fixed seed.</w:t>
+        <w:t xml:space="preserve">genome_amr</w:t>
+      </w:r>
+      <w:r>
+        <w:t xml:space="preserve"> </w:t>
+      </w:r>
+      <w:r>
+        <w:t xml:space="preserve">endpoint (snapshot 2026-10-22; 1,840,793 records, 39,598 genomes). Retrieval re-run the following</w:t>
+      </w:r>
+      <w:r>
+        <w:t xml:space="preserve"> </w:t>
+      </w:r>
+      <w:r>
+        <w:t xml:space="preserve">day reproduced byte-identical output. Every data pull writes a manifest recording the query,</w:t>
+      </w:r>
+      <w:r>
+        <w:t xml:space="preserve"> </w:t>
+      </w:r>
+      <w:r>
+        <w:t xml:space="preserve">timestamp, record count and checksum.</w:t>
+      </w:r>
+    </w:p>
+    <w:p>
+      <w:pPr>
+        <w:pStyle w:val="BodyText"/>
+      </w:pPr>
+      <w:r>
+        <w:t xml:space="preserve">Only records with</w:t>
+      </w:r>
+      <w:r>
+        <w:t xml:space="preserve"> </w:t>
+      </w:r>
+      <w:r>
+        <w:rPr>
+          <w:rStyle w:val="VerbatimChar"/>
+        </w:rPr>
+        <w:t xml:space="preserve">evidence = "Laboratory Method"</w:t>
+      </w:r>
+      <w:r>
+        <w:t xml:space="preserve"> </w:t>
+      </w:r>
+      <w:r>
+        <w:t xml:space="preserve">were used as labels (85,291 records, 7,276</w:t>
+      </w:r>
+      <w:r>
+        <w:t xml:space="preserve"> </w:t>
+      </w:r>
+      <w:r>
+        <w:t xml:space="preserve">genomes); computational predictions deposited in the same database were excluded as circular.</w:t>
+      </w:r>
+    </w:p>
+    <w:p>
+      <w:pPr>
+        <w:pStyle w:val="Heading3"/>
+      </w:pPr>
+      <w:bookmarkStart w:id="32" w:name="label-harmonisation"/>
+      <w:r>
+        <w:t xml:space="preserve">2.2 Label harmonisation</w:t>
+      </w:r>
+      <w:bookmarkEnd w:id="32"/>
+    </w:p>
+    <w:p>
+      <w:pPr>
+        <w:pStyle w:val="FirstParagraph"/>
+      </w:pPr>
+      <w:r>
+        <w:t xml:space="preserve">Labels follow EUCAST Clinical Breakpoint Tables v16.1 [10]. Each record carrying an MIC was</w:t>
+      </w:r>
+      <w:r>
+        <w:t xml:space="preserve"> </w:t>
+      </w:r>
+      <w:r>
+        <w:t xml:space="preserve">re-interpreted (S if MIC ≤ s_le, R if MIC &gt; r_gt, else I) rather than accepting the deposited</w:t>
+      </w:r>
+      <w:r>
+        <w:t xml:space="preserve"> </w:t>
+      </w:r>
+      <w:r>
+        <w:t xml:space="preserve">call. Censored measurements that cannot be resolved against the breakpoint yield no label.</w:t>
+      </w:r>
+    </w:p>
+    <w:p>
+      <w:pPr>
+        <w:pStyle w:val="BodyText"/>
+      </w:pPr>
+      <w:r>
+        <w:t xml:space="preserve">This recovered substantial data: records deposited without an S/I/R call were uninterpreted</w:t>
+      </w:r>
+      <w:r>
+        <w:t xml:space="preserve"> </w:t>
+      </w:r>
+      <w:r>
+        <w:t xml:space="preserve">measurements rather than missing data, and re-interpretation added 1,921 labelled genomes for</w:t>
+      </w:r>
+      <w:r>
+        <w:t xml:space="preserve"> </w:t>
+      </w:r>
+      <w:r>
+        <w:t xml:space="preserve">meropenem, 959 for ciprofloxacin, 598 for colistin and 560 for gentamicin. It also resolved most</w:t>
+      </w:r>
+      <w:r>
+        <w:t xml:space="preserve"> </w:t>
+      </w:r>
+      <w:r>
+        <w:t xml:space="preserve">apparent contradictions — meropenem label conflicts fell from 60 genomes to 8 — because the</w:t>
+      </w:r>
+      <w:r>
+        <w:t xml:space="preserve"> </w:t>
+      </w:r>
+      <w:r>
+        <w:t xml:space="preserve">majority were the same genome interpreted under different standards by different studies. Where</w:t>
+      </w:r>
+      <w:r>
+        <w:t xml:space="preserve"> </w:t>
+      </w:r>
+      <w:r>
+        <w:t xml:space="preserve">both a deposited and a re-interpreted call existed they agreed in 92.9–97.2% of records.</w:t>
+      </w:r>
+    </w:p>
+    <w:p>
+      <w:pPr>
+        <w:pStyle w:val="BodyText"/>
+      </w:pPr>
+      <w:r>
+        <w:t xml:space="preserve">Three policies were fixed in advance and recorded as decision records in the repository:</w:t>
+      </w:r>
+      <w:r>
+        <w:t xml:space="preserve"> </w:t>
+      </w:r>
+      <w:r>
+        <w:t xml:space="preserve">intermediate and conflicting labels are excluded; colistin labels are restricted to broth</w:t>
+      </w:r>
+      <w:r>
+        <w:t xml:space="preserve"> </w:t>
+      </w:r>
+      <w:r>
+        <w:t xml:space="preserve">microdilution, the only method EUCAST accepts for colistin MICs; and study-level label sets judged</w:t>
+      </w:r>
+      <w:r>
+        <w:t xml:space="preserve"> </w:t>
+      </w:r>
+      <w:r>
+        <w:t xml:space="preserve">implausible on review are flagged and excluded with evidence recorded (one flag applied, Section 3.9).</w:t>
+      </w:r>
+      <w:r>
+        <w:t xml:space="preserve"> </w:t>
+      </w:r>
+      <w:r>
+        <w:t xml:space="preserve">Tigecycline has no EUCAST breakpoint for</w:t>
+      </w:r>
+      <w:r>
+        <w:t xml:space="preserve"> </w:t>
+      </w:r>
+      <w:r>
+        <w:rPr>
+          <w:i/>
+        </w:rPr>
+        <w:t xml:space="preserve">K. pneumoniae</w:t>
+      </w:r>
+      <w:r>
+        <w:t xml:space="preserve">, so deposited calls were used.</w:t>
+      </w:r>
+    </w:p>
+    <w:p>
+      <w:pPr>
+        <w:pStyle w:val="Heading3"/>
+      </w:pPr>
+      <w:bookmarkStart w:id="33" w:name="assembly-quality-control-and-genotyping"/>
+      <w:r>
+        <w:t xml:space="preserve">2.3 Assembly quality control and genotyping</w:t>
+      </w:r>
+      <w:bookmarkEnd w:id="33"/>
+    </w:p>
+    <w:p>
+      <w:pPr>
+        <w:pStyle w:val="FirstParagraph"/>
+      </w:pPr>
+      <w:r>
+        <w:t xml:space="preserve">Assemblies were required to be</w:t>
+      </w:r>
+      <w:r>
+        <w:t xml:space="preserve"> </w:t>
+      </w:r>
+      <w:r>
+        <w:rPr>
+          <w:i/>
+        </w:rPr>
+        <w:t xml:space="preserve">K. pneumoniae</w:t>
+      </w:r>
+      <w:r>
+        <w:t xml:space="preserve"> </w:t>
+      </w:r>
+      <w:r>
+        <w:t xml:space="preserve">by both species field and genome name, 5.0–6.5 Mb,</w:t>
+      </w:r>
+      <w:r>
+        <w:t xml:space="preserve"> </w:t>
+      </w:r>
+      <w:r>
+        <w:t xml:space="preserve">≤500 contigs, N50 ≥20 kb, CheckM [11] completeness ≥95% and contamination ≤5%. Agreement between</w:t>
+      </w:r>
+      <w:r>
+        <w:t xml:space="preserve"> </w:t>
+      </w:r>
+      <w:r>
+        <w:t xml:space="preserve">the species field and the genome name was required, so that internally inconsistent BV-BRC records</w:t>
+      </w:r>
+      <w:r>
+        <w:t xml:space="preserve"> </w:t>
+      </w:r>
+      <w:r>
+        <w:t xml:space="preserve">are excluded.</w:t>
+      </w:r>
+    </w:p>
+    <w:p>
+      <w:pPr>
+        <w:pStyle w:val="BodyText"/>
+      </w:pPr>
+      <w:r>
+        <w:t xml:space="preserve">Assemblies were downloaded from BV-BRC [12] by genome identifier rather than by NCBI assembly</w:t>
+      </w:r>
+      <w:r>
+        <w:t xml:space="preserve"> </w:t>
+      </w:r>
+      <w:r>
+        <w:t xml:space="preserve">accession, because many QC-passing genomes carry no such accession, and were validated for format</w:t>
+      </w:r>
+      <w:r>
+        <w:t xml:space="preserve"> </w:t>
+      </w:r>
+      <w:r>
+        <w:t xml:space="preserve">and length. AMRFinderPlus 4.2.7 [2] (database 2026-08-07.1) was run in nucleotide mode with</w:t>
+      </w:r>
+      <w:r>
+        <w:t xml:space="preserve"> </w:t>
+      </w:r>
+      <w:r>
+        <w:rPr>
+          <w:rStyle w:val="VerbatimChar"/>
+        </w:rPr>
+        <w:t xml:space="preserve">--organism Klebsiella_pneumoniae --plus</w:t>
+      </w:r>
+      <w:r>
+        <w:t xml:space="preserve">, and Kleborate 3.2.4 [3] with Kaptive 3.2.2 [13] using</w:t>
+      </w:r>
+      <w:r>
+        <w:t xml:space="preserve"> </w:t>
+      </w:r>
+      <w:r>
+        <w:t xml:space="preserve">the</w:t>
+      </w:r>
+      <w:r>
+        <w:t xml:space="preserve"> </w:t>
+      </w:r>
+      <w:r>
+        <w:rPr>
+          <w:rStyle w:val="VerbatimChar"/>
+        </w:rPr>
+        <w:t xml:space="preserve">kpsc</w:t>
+      </w:r>
+      <w:r>
+        <w:t xml:space="preserve"> </w:t>
+      </w:r>
+      <w:r>
+        <w:t xml:space="preserve">preset. Tool calls were verified to be identical on two machines running different</w:t>
+      </w:r>
+      <w:r>
+        <w:t xml:space="preserve"> </w:t>
+      </w:r>
+      <w:r>
+        <w:t xml:space="preserve">operating systems and processor architectures.</w:t>
+      </w:r>
+    </w:p>
+    <w:p>
+      <w:pPr>
+        <w:pStyle w:val="Heading3"/>
+      </w:pPr>
+      <w:bookmarkStart w:id="34" w:name="rule-based-prediction"/>
+      <w:r>
+        <w:t xml:space="preserve">2.4 Rule-based prediction</w:t>
+      </w:r>
+      <w:bookmarkEnd w:id="34"/>
+    </w:p>
+    <w:p>
+      <w:pPr>
+        <w:pStyle w:val="FirstParagraph"/>
+      </w:pPr>
+      <w:r>
+        <w:t xml:space="preserve">Per-drug rules were specified from tool output before phenotype comparison: acquired carbapenemase</w:t>
+      </w:r>
+      <w:r>
+        <w:t xml:space="preserve"> </w:t>
+      </w:r>
+      <w:r>
+        <w:t xml:space="preserve">for meropenem; QRDR mutation or acquired quinolone gene for ciprofloxacin; aminoglycoside-modifying</w:t>
+      </w:r>
+      <w:r>
+        <w:t xml:space="preserve"> </w:t>
+      </w:r>
+      <w:r>
+        <w:t xml:space="preserve">enzyme or 16S rRNA methyltransferase for gentamicin;</w:t>
+      </w:r>
+      <w:r>
+        <w:t xml:space="preserve"> </w:t>
+      </w:r>
+      <w:r>
+        <w:rPr>
+          <w:i/>
+        </w:rPr>
+        <w:t xml:space="preserve">mcr</w:t>
+      </w:r>
+      <w:r>
+        <w:t xml:space="preserve"> </w:t>
+      </w:r>
+      <w:r>
+        <w:t xml:space="preserve">or</w:t>
+      </w:r>
+      <w:r>
+        <w:t xml:space="preserve"> </w:t>
+      </w:r>
+      <w:r>
+        <w:rPr>
+          <w:i/>
+        </w:rPr>
+        <w:t xml:space="preserve">mgrB</w:t>
+      </w:r>
+      <w:r>
+        <w:t xml:space="preserve">/</w:t>
+      </w:r>
+      <w:r>
+        <w:rPr>
+          <w:i/>
+        </w:rPr>
+        <w:t xml:space="preserve">pmrAB</w:t>
+      </w:r>
+      <w:r>
+        <w:t xml:space="preserve">/</w:t>
+      </w:r>
+      <w:r>
+        <w:rPr>
+          <w:i/>
+        </w:rPr>
+        <w:t xml:space="preserve">phoPQ</w:t>
+      </w:r>
+      <w:r>
+        <w:t xml:space="preserve"> </w:t>
+      </w:r>
+      <w:r>
+        <w:t xml:space="preserve">determinants</w:t>
+      </w:r>
+      <w:r>
+        <w:t xml:space="preserve"> </w:t>
+      </w:r>
+      <w:r>
+        <w:t xml:space="preserve">for colistin; acquired</w:t>
+      </w:r>
+      <w:r>
+        <w:t xml:space="preserve"> </w:t>
+      </w:r>
+      <w:r>
+        <w:rPr>
+          <w:i/>
+        </w:rPr>
+        <w:t xml:space="preserve">tet(X)</w:t>
+      </w:r>
+      <w:r>
+        <w:t xml:space="preserve"> </w:t>
+      </w:r>
+      <w:r>
+        <w:t xml:space="preserve">or</w:t>
+      </w:r>
+      <w:r>
+        <w:t xml:space="preserve"> </w:t>
+      </w:r>
+      <w:r>
+        <w:rPr>
+          <w:i/>
+        </w:rPr>
+        <w:t xml:space="preserve">tmexCD-toprJ</w:t>
+      </w:r>
+      <w:r>
+        <w:t xml:space="preserve"> </w:t>
+      </w:r>
+      <w:r>
+        <w:t xml:space="preserve">for tigecycline.</w:t>
+      </w:r>
+    </w:p>
+    <w:p>
+      <w:pPr>
+        <w:pStyle w:val="BodyText"/>
+      </w:pPr>
+      <w:r>
+        <w:t xml:space="preserve">Two corrections were applied after a 524-genome pilot, both tool-annotation artefacts rather than</w:t>
+      </w:r>
+      <w:r>
+        <w:t xml:space="preserve"> </w:t>
+      </w:r>
+      <w:r>
+        <w:t xml:space="preserve">biology. AMRFinderPlus assigns the intrinsic chromosomal</w:t>
+      </w:r>
+      <w:r>
+        <w:t xml:space="preserve"> </w:t>
+      </w:r>
+      <w:r>
+        <w:rPr>
+          <w:i/>
+        </w:rPr>
+        <w:t xml:space="preserve">oqxAB</w:t>
+      </w:r>
+      <w:r>
+        <w:t xml:space="preserve"> </w:t>
+      </w:r>
+      <w:r>
+        <w:t xml:space="preserve">pump to tigecycline as well as</w:t>
+      </w:r>
+      <w:r>
+        <w:t xml:space="preserve"> </w:t>
+      </w:r>
+      <w:r>
+        <w:t xml:space="preserve">quinolones; since essentially all</w:t>
+      </w:r>
+      <w:r>
+        <w:t xml:space="preserve"> </w:t>
+      </w:r>
+      <w:r>
+        <w:rPr>
+          <w:i/>
+        </w:rPr>
+        <w:t xml:space="preserve">K. pneumoniae</w:t>
+      </w:r>
+      <w:r>
+        <w:t xml:space="preserve"> </w:t>
+      </w:r>
+      <w:r>
+        <w:t xml:space="preserve">carry</w:t>
+      </w:r>
+      <w:r>
+        <w:t xml:space="preserve"> </w:t>
+      </w:r>
+      <w:r>
+        <w:rPr>
+          <w:i/>
+        </w:rPr>
+        <w:t xml:space="preserve">oqxAB</w:t>
+      </w:r>
+      <w:r>
+        <w:t xml:space="preserve"> </w:t>
+      </w:r>
+      <w:r>
+        <w:t xml:space="preserve">this produced 88 of 91 pilot</w:t>
+      </w:r>
+      <w:r>
+        <w:t xml:space="preserve"> </w:t>
+      </w:r>
+      <w:r>
+        <w:t xml:space="preserve">tigecycline false positives, and</w:t>
+      </w:r>
+      <w:r>
+        <w:t xml:space="preserve"> </w:t>
+      </w:r>
+      <w:r>
+        <w:rPr>
+          <w:i/>
+        </w:rPr>
+        <w:t xml:space="preserve">oqxAB</w:t>
+      </w:r>
+      <w:r>
+        <w:t xml:space="preserve"> </w:t>
+      </w:r>
+      <w:r>
+        <w:t xml:space="preserve">is now excluded for all drugs. Efflux-regulator variants</w:t>
+      </w:r>
+      <w:r>
+        <w:t xml:space="preserve"> </w:t>
+      </w:r>
+      <w:r>
+        <w:t xml:space="preserve">(</w:t>
+      </w:r>
+      <w:r>
+        <w:rPr>
+          <w:i/>
+        </w:rPr>
+        <w:t xml:space="preserve">oqxR</w:t>
+      </w:r>
+      <w:r>
+        <w:t xml:space="preserve">,</w:t>
+      </w:r>
+      <w:r>
+        <w:t xml:space="preserve"> </w:t>
+      </w:r>
+      <w:r>
+        <w:rPr>
+          <w:i/>
+        </w:rPr>
+        <w:t xml:space="preserve">ramR</w:t>
+      </w:r>
+      <w:r>
+        <w:t xml:space="preserve">,</w:t>
+      </w:r>
+      <w:r>
+        <w:t xml:space="preserve"> </w:t>
+      </w:r>
+      <w:r>
+        <w:rPr>
+          <w:i/>
+        </w:rPr>
+        <w:t xml:space="preserve">acrR</w:t>
+      </w:r>
+      <w:r>
+        <w:t xml:space="preserve">) produced 21 of 26 pilot ciprofloxacin false positives and are reported as</w:t>
+      </w:r>
+      <w:r>
+        <w:t xml:space="preserve"> </w:t>
+      </w:r>
+      <w:r>
+        <w:t xml:space="preserve">a separate tier rather than folded into the core rule.</w:t>
+      </w:r>
+    </w:p>
+    <w:p>
+      <w:pPr>
+        <w:pStyle w:val="Heading3"/>
+      </w:pPr>
+      <w:bookmarkStart w:id="35" w:name="targeted-mgrb-integrity-check"/>
+      <w:r>
+        <w:t xml:space="preserve">2.5 Targeted</w:t>
+      </w:r>
+      <w:r>
+        <w:t xml:space="preserve"> </w:t>
+      </w:r>
+      <w:r>
+        <w:rPr>
+          <w:i/>
+        </w:rPr>
+        <w:t xml:space="preserve">mgrB</w:t>
+      </w:r>
+      <w:r>
+        <w:t xml:space="preserve"> </w:t>
+      </w:r>
+      <w:r>
+        <w:t xml:space="preserve">integrity check</w:t>
+      </w:r>
+      <w:bookmarkEnd w:id="35"/>
+    </w:p>
+    <w:p>
+      <w:pPr>
+        <w:pStyle w:val="FirstParagraph"/>
+      </w:pPr>
+      <w:r>
+        <w:t xml:space="preserve">The MgrB reference protein (WP_002911375.1, 47 aa) was searched against each assembly with tblastn [14]</w:t>
+      </w:r>
+      <w:r>
+        <w:t xml:space="preserve"> </w:t>
+      </w:r>
+      <w:r>
+        <w:t xml:space="preserve">(e-value ≤1e-5, hits ≥10 aa) and the best hit classified as</w:t>
+      </w:r>
+      <w:r>
+        <w:t xml:space="preserve"> </w:t>
+      </w:r>
+      <w:r>
+        <w:rPr>
+          <w:b/>
+        </w:rPr>
+        <w:t xml:space="preserve">intact</w:t>
+      </w:r>
+      <w:r>
+        <w:t xml:space="preserve"> </w:t>
+      </w:r>
+      <w:r>
+        <w:t xml:space="preserve">(full-length, no residue</w:t>
+      </w:r>
+      <w:r>
+        <w:t xml:space="preserve"> </w:t>
+      </w:r>
+      <w:r>
+        <w:t xml:space="preserve">differences);</w:t>
+      </w:r>
+      <w:r>
+        <w:t xml:space="preserve"> </w:t>
+      </w:r>
+      <w:r>
+        <w:rPr>
+          <w:b/>
+        </w:rPr>
+        <w:t xml:space="preserve">missense</w:t>
+      </w:r>
+      <w:r>
+        <w:t xml:space="preserve"> </w:t>
+      </w:r>
+      <w:r>
+        <w:t xml:space="preserve">(full-length with substitutions);</w:t>
+      </w:r>
+      <w:r>
+        <w:t xml:space="preserve"> </w:t>
+      </w:r>
+      <w:r>
+        <w:rPr>
+          <w:b/>
+        </w:rPr>
+        <w:t xml:space="preserve">premature stop</w:t>
+      </w:r>
+      <w:r>
+        <w:t xml:space="preserve">;</w:t>
+      </w:r>
+      <w:r>
+        <w:t xml:space="preserve"> </w:t>
+      </w:r>
+      <w:r>
+        <w:rPr>
+          <w:b/>
+        </w:rPr>
+        <w:t xml:space="preserve">frameshift or indel</w:t>
+      </w:r>
+      <w:r>
+        <w:t xml:space="preserve"> </w:t>
+      </w:r>
+      <w:r>
+        <w:t xml:space="preserve">(two fragments on one contig &lt;300 bp apart);</w:t>
+      </w:r>
+      <w:r>
+        <w:t xml:space="preserve"> </w:t>
+      </w:r>
+      <w:r>
+        <w:rPr>
+          <w:b/>
+        </w:rPr>
+        <w:t xml:space="preserve">assembled insertion</w:t>
+      </w:r>
+      <w:r>
+        <w:t xml:space="preserve"> </w:t>
+      </w:r>
+      <w:r>
+        <w:t xml:space="preserve">(two</w:t>
+      </w:r>
+      <w:r>
+        <w:t xml:space="preserve"> </w:t>
+      </w:r>
+      <w:r>
+        <w:t xml:space="preserve">fragments &gt;300 bp apart);</w:t>
+      </w:r>
+      <w:r>
+        <w:t xml:space="preserve"> </w:t>
+      </w:r>
+      <w:r>
+        <w:rPr>
+          <w:b/>
+        </w:rPr>
+        <w:t xml:space="preserve">split contigs</w:t>
+      </w:r>
+      <w:r>
+        <w:t xml:space="preserve">;</w:t>
+      </w:r>
+      <w:r>
+        <w:t xml:space="preserve"> </w:t>
+      </w:r>
+      <w:r>
+        <w:rPr>
+          <w:b/>
+        </w:rPr>
+        <w:t xml:space="preserve">contig break</w:t>
+      </w:r>
+      <w:r>
+        <w:t xml:space="preserve"> </w:t>
+      </w:r>
+      <w:r>
+        <w:t xml:space="preserve">(alignment terminating at a contig</w:t>
+      </w:r>
+      <w:r>
+        <w:t xml:space="preserve"> </w:t>
+      </w:r>
+      <w:r>
+        <w:t xml:space="preserve">edge);</w:t>
+      </w:r>
+      <w:r>
+        <w:t xml:space="preserve"> </w:t>
+      </w:r>
+      <w:r>
+        <w:rPr>
+          <w:b/>
+        </w:rPr>
+        <w:t xml:space="preserve">partial</w:t>
+      </w:r>
+      <w:r>
+        <w:t xml:space="preserve">; or</w:t>
+      </w:r>
+      <w:r>
+        <w:t xml:space="preserve"> </w:t>
+      </w:r>
+      <w:r>
+        <w:rPr>
+          <w:b/>
+        </w:rPr>
+        <w:t xml:space="preserve">absent</w:t>
+      </w:r>
+      <w:r>
+        <w:t xml:space="preserve">. All categories except intact and missense count as disrupted.</w:t>
+      </w:r>
+      <w:r>
+        <w:t xml:space="preserve"> </w:t>
+      </w:r>
+      <w:r>
+        <w:t xml:space="preserve">The split-contigs, contig-break and partial categories are the assembly signature described</w:t>
+      </w:r>
+      <w:r>
+        <w:t xml:space="preserve"> </w:t>
+      </w:r>
+      <w:r>
+        <w:t xml:space="preserve">in Section 1.</w:t>
+      </w:r>
+    </w:p>
+    <w:p>
+      <w:pPr>
+        <w:pStyle w:val="BodyText"/>
+      </w:pPr>
+      <w:r>
+        <w:t xml:space="preserve">Residue differences are enumerated by direct comparison of aligned sequences, ignoring query</w:t>
+      </w:r>
+      <w:r>
+        <w:t xml:space="preserve"> </w:t>
+      </w:r>
+      <w:r>
+        <w:t xml:space="preserve">position 1, because tblastn translates alternative start codons (GTG, TTG) as V or L rather than</w:t>
+      </w:r>
+      <w:r>
+        <w:t xml:space="preserve"> </w:t>
+      </w:r>
+      <w:r>
+        <w:t xml:space="preserve">M. Classifying variants by percentage identity instead produces a systematic artefact at the start</w:t>
+      </w:r>
+      <w:r>
+        <w:t xml:space="preserve"> </w:t>
+      </w:r>
+      <w:r>
+        <w:t xml:space="preserve">codon, quantified in Section 3.3.</w:t>
+      </w:r>
+    </w:p>
+    <w:p>
+      <w:pPr>
+        <w:pStyle w:val="Heading3"/>
+      </w:pPr>
+      <w:bookmarkStart w:id="36" w:name="Xfcd1d0cf32165564d5133920c147139c7c0f246"/>
+      <w:r>
+        <w:t xml:space="preserve">2.6 Testing the insertion-sequence interpretation</w:t>
+      </w:r>
+      <w:bookmarkEnd w:id="36"/>
+    </w:p>
+    <w:p>
+      <w:pPr>
+        <w:pStyle w:val="FirstParagraph"/>
+      </w:pPr>
+      <w:r>
+        <w:t xml:space="preserve">The split-contigs, contig-break and partial categories are inferences from assembly</w:t>
+      </w:r>
+      <w:r>
+        <w:t xml:space="preserve"> </w:t>
+      </w:r>
+      <w:r>
+        <w:t xml:space="preserve">structure, so we tested three predictions that follow from IS insertion but not from incidental</w:t>
+      </w:r>
+      <w:r>
+        <w:t xml:space="preserve"> </w:t>
+      </w:r>
+      <w:r>
+        <w:t xml:space="preserve">fragmentation. First, position: the break should coincide with</w:t>
+      </w:r>
+      <w:r>
+        <w:t xml:space="preserve"> </w:t>
+      </w:r>
+      <w:r>
+        <w:rPr>
+          <w:i/>
+        </w:rPr>
+        <w:t xml:space="preserve">mgrB</w:t>
+      </w:r>
+      <w:r>
+        <w:t xml:space="preserve">, compared against genomes</w:t>
+      </w:r>
+      <w:r>
+        <w:t xml:space="preserve"> </w:t>
+      </w:r>
+      <w:r>
+        <w:t xml:space="preserve">with intact</w:t>
+      </w:r>
+      <w:r>
+        <w:t xml:space="preserve"> </w:t>
+      </w:r>
+      <w:r>
+        <w:rPr>
+          <w:i/>
+        </w:rPr>
+        <w:t xml:space="preserve">mgrB</w:t>
+      </w:r>
+      <w:r>
+        <w:t xml:space="preserve">. Second, repetitiveness: sequence at the</w:t>
+      </w:r>
+      <w:r>
+        <w:t xml:space="preserve"> </w:t>
+      </w:r>
+      <w:r>
+        <w:rPr>
+          <w:i/>
+        </w:rPr>
+        <w:t xml:space="preserve">mgrB</w:t>
+      </w:r>
+      <w:r>
+        <w:t xml:space="preserve">-adjacent contig end should have</w:t>
+      </w:r>
+      <w:r>
+        <w:t xml:space="preserve"> </w:t>
+      </w:r>
+      <w:r>
+        <w:t xml:space="preserve">copies elsewhere in the same assembly. Because contig ends are repeat-enriched in general, this was</w:t>
+      </w:r>
+      <w:r>
+        <w:t xml:space="preserve"> </w:t>
+      </w:r>
+      <w:r>
+        <w:t xml:space="preserve">compared against randomly chosen other contig ends in the same assemblies, truncated to the same</w:t>
+      </w:r>
+      <w:r>
+        <w:t xml:space="preserve"> </w:t>
+      </w:r>
+      <w:r>
+        <w:t xml:space="preserve">length as each genome’s</w:t>
+      </w:r>
+      <w:r>
+        <w:t xml:space="preserve"> </w:t>
+      </w:r>
+      <w:r>
+        <w:rPr>
+          <w:i/>
+        </w:rPr>
+        <w:t xml:space="preserve">mgrB</w:t>
+      </w:r>
+      <w:r>
+        <w:t xml:space="preserve"> </w:t>
+      </w:r>
+      <w:r>
+        <w:t xml:space="preserve">flank. Third, recurrence: the same sequences should appear at</w:t>
+      </w:r>
+      <w:r>
+        <w:t xml:space="preserve"> </w:t>
+      </w:r>
+      <w:r>
+        <w:rPr>
+          <w:i/>
+        </w:rPr>
+        <w:t xml:space="preserve">mgrB</w:t>
+      </w:r>
+      <w:r>
+        <w:t xml:space="preserve"> </w:t>
+      </w:r>
+      <w:r>
+        <w:t xml:space="preserve">in unrelated isolates. Flanks were taken as up to 600 bp of contig end adjacent to</w:t>
+      </w:r>
+      <w:r>
+        <w:t xml:space="preserve"> </w:t>
+      </w:r>
+      <w:r>
+        <w:rPr>
+          <w:i/>
+        </w:rPr>
+        <w:t xml:space="preserve">mgrB</w:t>
+      </w:r>
+      <w:r>
+        <w:t xml:space="preserve"> </w:t>
+      </w:r>
+      <w:r>
+        <w:t xml:space="preserve">(minimum</w:t>
+      </w:r>
+      <w:r>
+        <w:t xml:space="preserve"> </w:t>
+      </w:r>
+      <w:r>
+        <w:t xml:space="preserve">50 bp) and compared by blastn at ≥95% identity (within genome) or ≥90% (between genomes) over ≥80%</w:t>
+      </w:r>
+      <w:r>
+        <w:t xml:space="preserve"> </w:t>
+      </w:r>
+      <w:r>
+        <w:t xml:space="preserve">of the flank.</w:t>
+      </w:r>
+    </w:p>
+    <w:p>
+      <w:pPr>
+        <w:pStyle w:val="Heading3"/>
+      </w:pPr>
+      <w:bookmarkStart w:id="37" w:name="validating-the-mgrb-rule"/>
+      <w:r>
+        <w:t xml:space="preserve">2.7 Validating the</w:t>
+      </w:r>
+      <w:r>
+        <w:t xml:space="preserve"> </w:t>
+      </w:r>
+      <w:r>
+        <w:rPr>
+          <w:i/>
+        </w:rPr>
+        <w:t xml:space="preserve">mgrB</w:t>
+      </w:r>
+      <w:r>
+        <w:t xml:space="preserve"> </w:t>
+      </w:r>
+      <w:r>
+        <w:t xml:space="preserve">rule</w:t>
+      </w:r>
+      <w:bookmarkEnd w:id="37"/>
+    </w:p>
+    <w:p>
+      <w:pPr>
+        <w:pStyle w:val="FirstParagraph"/>
+      </w:pPr>
+      <w:r>
+        <w:t xml:space="preserve">Because three disruption categories are inferred from assembly structure, we tested whether the</w:t>
+      </w:r>
+      <w:r>
+        <w:t xml:space="preserve"> </w:t>
+      </w:r>
+      <w:r>
+        <w:t xml:space="preserve">association with phenotype could reflect assembly fragmentation by comparing contig counts and N50</w:t>
+      </w:r>
+      <w:r>
+        <w:t xml:space="preserve"> </w:t>
+      </w:r>
+      <w:r>
+        <w:t xml:space="preserve">between calls, and by stratifying the colistin association on assembly-quality quartile.</w:t>
+      </w:r>
+    </w:p>
+    <w:p>
+      <w:pPr>
+        <w:pStyle w:val="BodyText"/>
+      </w:pPr>
+      <w:r>
+        <w:t xml:space="preserve">Because the decision to treat missense variants as resistance-predicting was made after observing</w:t>
+      </w:r>
+      <w:r>
+        <w:t xml:space="preserve"> </w:t>
+      </w:r>
+      <w:r>
+        <w:t xml:space="preserve">their enrichment in this cohort, we re-estimated that tier by leave-one-study-out: variants were</w:t>
+      </w:r>
+      <w:r>
+        <w:t xml:space="preserve"> </w:t>
+      </w:r>
+      <w:r>
+        <w:t xml:space="preserve">selected on training studies only (≥3 genomes, &gt;50% resistant) and applied to the held-out study.</w:t>
+      </w:r>
+      <w:r>
+        <w:t xml:space="preserve"> </w:t>
+      </w:r>
+      <w:r>
+        <w:t xml:space="preserve">The disruption tier, being mechanism-specified and fitted to nothing, was evaluated in the same</w:t>
+      </w:r>
+      <w:r>
+        <w:t xml:space="preserve"> </w:t>
+      </w:r>
+      <w:r>
+        <w:t xml:space="preserve">framework for comparison.</w:t>
+      </w:r>
+    </w:p>
+    <w:p>
+      <w:pPr>
+        <w:pStyle w:val="Heading3"/>
+      </w:pPr>
+      <w:bookmarkStart w:id="38" w:name="attributing-performance-to-lineage"/>
+      <w:r>
+        <w:t xml:space="preserve">2.8 Attributing performance to lineage</w:t>
+      </w:r>
+      <w:bookmarkEnd w:id="38"/>
+    </w:p>
+    <w:p>
+      <w:pPr>
+        <w:pStyle w:val="FirstParagraph"/>
+      </w:pPr>
+      <w:r>
+        <w:t xml:space="preserve">To test directly, rather than infer, how much performance is obtainable from lineage, we built a</w:t>
+      </w:r>
+      <w:r>
+        <w:t xml:space="preserve"> </w:t>
+      </w:r>
+      <w:r>
+        <w:t xml:space="preserve">predictor using sequence type alone: for each test genome it returns the majority label of that</w:t>
+      </w:r>
+      <w:r>
+        <w:t xml:space="preserve"> </w:t>
+      </w:r>
+      <w:r>
+        <w:t xml:space="preserve">genome’s sequence type among training genomes, falling back to the overall training majority when</w:t>
+      </w:r>
+      <w:r>
+        <w:t xml:space="preserve"> </w:t>
+      </w:r>
+      <w:r>
+        <w:t xml:space="preserve">the type is unseen. It uses no resistance determinant. We also measured, for each split scheme,</w:t>
+      </w:r>
+      <w:r>
+        <w:t xml:space="preserve"> </w:t>
+      </w:r>
+      <w:r>
+        <w:t xml:space="preserve">the fraction of test genomes sharing a sequence type or a BioProject with any training genome.</w:t>
+      </w:r>
+    </w:p>
+    <w:p>
+      <w:pPr>
+        <w:pStyle w:val="Heading3"/>
+      </w:pPr>
+      <w:bookmarkStart w:id="39" w:name="benchmark"/>
+      <w:r>
+        <w:t xml:space="preserve">2.9 Benchmark</w:t>
+      </w:r>
+      <w:bookmarkEnd w:id="39"/>
+    </w:p>
+    <w:p>
+      <w:pPr>
+        <w:pStyle w:val="FirstParagraph"/>
+      </w:pPr>
+      <w:r>
+        <w:t xml:space="preserve">Features were 226 binary indicators per genome: AMRFinderPlus gene families (allele suffixes</w:t>
+      </w:r>
+      <w:r>
+        <w:t xml:space="preserve"> </w:t>
+      </w:r>
+      <w:r>
+        <w:t xml:space="preserve">collapsed, OXA-48-like kept distinct from other OXA enzymes), 100 point-mutation calls, 33</w:t>
+      </w:r>
+      <w:r>
+        <w:t xml:space="preserve"> </w:t>
+      </w:r>
+      <w:r>
+        <w:t xml:space="preserve">AMRFinderPlus functional subclasses, and two</w:t>
+      </w:r>
+      <w:r>
+        <w:t xml:space="preserve"> </w:t>
+      </w:r>
+      <w:r>
+        <w:rPr>
+          <w:i/>
+        </w:rPr>
+        <w:t xml:space="preserve">mgrB</w:t>
+      </w:r>
+      <w:r>
+        <w:t xml:space="preserve"> </w:t>
+      </w:r>
+      <w:r>
+        <w:t xml:space="preserve">features. Features present in fewer than five</w:t>
+      </w:r>
+      <w:r>
+        <w:t xml:space="preserve"> </w:t>
+      </w:r>
+      <w:r>
+        <w:t xml:space="preserve">genomes were dropped.</w:t>
+      </w:r>
+    </w:p>
+    <w:p>
+      <w:pPr>
+        <w:pStyle w:val="BodyText"/>
+      </w:pPr>
+      <w:r>
+        <w:t xml:space="preserve">Three predictors were compared: the per-drug rule (for colistin including mechanism-specified</w:t>
+      </w:r>
+      <w:r>
+        <w:t xml:space="preserve"> </w:t>
+      </w:r>
+      <w:r>
+        <w:rPr>
+          <w:i/>
+        </w:rPr>
+        <w:t xml:space="preserve">mgrB</w:t>
+      </w:r>
+      <w:r>
+        <w:t xml:space="preserve"> </w:t>
+      </w:r>
+      <w:r>
+        <w:t xml:space="preserve">disruption, but not the missense tier, for the reason given in Section 3.5); L2 logistic regression [15]</w:t>
+      </w:r>
+      <w:r>
+        <w:t xml:space="preserve"> </w:t>
+      </w:r>
+      <w:r>
+        <w:t xml:space="preserve">(C = 1, class-balanced); and gradient boosting (HistGradientBoostingClassifier, 200 iterations, 15</w:t>
+      </w:r>
+      <w:r>
+        <w:t xml:space="preserve"> </w:t>
+      </w:r>
+      <w:r>
+        <w:t xml:space="preserve">leaves, class-balanced). Hyperparameters were fixed rather than tuned, since the object of study is</w:t>
+      </w:r>
+      <w:r>
+        <w:t xml:space="preserve"> </w:t>
+      </w:r>
+      <w:r>
+        <w:t xml:space="preserve">validation design rather than peak performance.</w:t>
+      </w:r>
+    </w:p>
+    <w:p>
+      <w:pPr>
+        <w:pStyle w:val="BodyText"/>
+      </w:pPr>
+      <w:r>
+        <w:t xml:space="preserve">Four split schemes were used: random 5-fold; study-aware 5-fold grouped by BioProject;</w:t>
+      </w:r>
+      <w:r>
+        <w:t xml:space="preserve"> </w:t>
+      </w:r>
+      <w:r>
+        <w:t xml:space="preserve">lineage-aware 5-fold grouped by sequence type; and temporal. Genomes with missing group metadata</w:t>
+      </w:r>
+      <w:r>
+        <w:t xml:space="preserve"> </w:t>
+      </w:r>
+      <w:r>
+        <w:t xml:space="preserve">were assigned singleton groups so absent metadata can never merge unrelated isolates. Metrics are</w:t>
+      </w:r>
+      <w:r>
+        <w:t xml:space="preserve"> </w:t>
+      </w:r>
+      <w:r>
+        <w:t xml:space="preserve">computed on pooled held-out predictions with 95% Wilson intervals [16], reported both on all test labels</w:t>
+      </w:r>
+      <w:r>
+        <w:t xml:space="preserve"> </w:t>
+      </w:r>
+      <w:r>
+        <w:t xml:space="preserve">and with borderline-MIC labels removed. A split is scored only if its test set contains at least 10</w:t>
+      </w:r>
+      <w:r>
+        <w:t xml:space="preserve"> </w:t>
+      </w:r>
+      <w:r>
+        <w:t xml:space="preserve">resistant and 10 susceptible genomes. Differences between predictors were assessed by paired</w:t>
+      </w:r>
+      <w:r>
+        <w:t xml:space="preserve"> </w:t>
+      </w:r>
+      <w:r>
+        <w:t xml:space="preserve">bootstrap over held-out genomes (2,000 resamples), resampling once per iteration and recomputing</w:t>
+      </w:r>
+      <w:r>
+        <w:t xml:space="preserve"> </w:t>
+      </w:r>
+      <w:r>
+        <w:t xml:space="preserve">both predictors on the same resampled set.</w:t>
+      </w:r>
+    </w:p>
+    <w:p>
+      <w:pPr>
+        <w:pStyle w:val="BodyText"/>
+      </w:pPr>
+      <w:r>
+        <w:t xml:space="preserve">Comparing every drug, split scheme and predictor pair yields a family of 54 tests, not one, so some</w:t>
+      </w:r>
+      <w:r>
+        <w:t xml:space="preserve"> </w:t>
+      </w:r>
+      <w:r>
+        <w:t xml:space="preserve">intervals will exclude zero by chance. Each comparison therefore also carries a two-sided bootstrap</w:t>
+      </w:r>
+      <w:r>
+        <w:t xml:space="preserve"> </w:t>
+      </w:r>
+      <w:r>
+        <w:t xml:space="preserve">p-value, floored at 1/2,000 since no finer resolution exists, and a Benjamini–Hochberg [17] q-value</w:t>
+      </w:r>
+      <w:r>
+        <w:t xml:space="preserve"> </w:t>
+      </w:r>
+      <w:r>
+        <w:t xml:space="preserve">computed across the whole family. Benjamini–Hochberg is our primary correction: the comparisons</w:t>
+      </w:r>
+      <w:r>
+        <w:t xml:space="preserve"> </w:t>
+      </w:r>
+      <w:r>
+        <w:t xml:space="preserve">share predictors, genomes and folds and are therefore positively dependent, and controlling the</w:t>
+      </w:r>
+      <w:r>
+        <w:t xml:space="preserve"> </w:t>
+      </w:r>
+      <w:r>
+        <w:t xml:space="preserve">false discovery rate is the appropriate goal for a benchmark mapping where differences exist rather</w:t>
+      </w:r>
+      <w:r>
+        <w:t xml:space="preserve"> </w:t>
+      </w:r>
+      <w:r>
+        <w:t xml:space="preserve">than testing a single hypothesis. We also report which comparisons survive the far stricter</w:t>
+      </w:r>
+      <w:r>
+        <w:t xml:space="preserve"> </w:t>
+      </w:r>
+      <w:r>
+        <w:t xml:space="preserve">Bonferroni threshold (p &lt; 0.00093), and we treat only those as established beyond doubt.</w:t>
+      </w:r>
+    </w:p>
+    <w:p>
+      <w:pPr>
+        <w:pStyle w:val="Heading3"/>
+      </w:pPr>
+      <w:bookmarkStart w:id="40" w:name="external-validation"/>
+      <w:r>
+        <w:t xml:space="preserve">2.10 External validation</w:t>
+      </w:r>
+      <w:bookmarkEnd w:id="40"/>
+    </w:p>
+    <w:p>
+      <w:pPr>
+        <w:pStyle w:val="FirstParagraph"/>
+      </w:pPr>
+      <w:r>
+        <w:t xml:space="preserve">Leave-one-study-out within BV-BRC holds out a study but not an aggregator: every such study was</w:t>
+      </w:r>
+      <w:r>
+        <w:t xml:space="preserve"> </w:t>
+      </w:r>
+      <w:r>
+        <w:t xml:space="preserve">curated the same way and was available to us when the rule was specified. To test the rule on</w:t>
+      </w:r>
+      <w:r>
+        <w:t xml:space="preserve"> </w:t>
+      </w:r>
+      <w:r>
+        <w:t xml:space="preserve">genomes whose phenotypes we had no access to, we assembled a cohort from NCBI Pathogen Detection,</w:t>
+      </w:r>
+      <w:r>
+        <w:t xml:space="preserve"> </w:t>
+      </w:r>
+      <w:r>
+        <w:t xml:space="preserve">joining submitted antimicrobial susceptibility results (</w:t>
+      </w:r>
+      <w:r>
+        <w:rPr>
+          <w:rStyle w:val="VerbatimChar"/>
+        </w:rPr>
+        <w:t xml:space="preserve">pdbrowser.ast</w:t>
+      </w:r>
+      <w:r>
+        <w:t xml:space="preserve">) to isolate records</w:t>
+      </w:r>
+      <w:r>
+        <w:t xml:space="preserve"> </w:t>
+      </w:r>
+      <w:r>
+        <w:t xml:space="preserve">(</w:t>
+      </w:r>
+      <w:r>
+        <w:rPr>
+          <w:rStyle w:val="VerbatimChar"/>
+        </w:rPr>
+        <w:t xml:space="preserve">pdbrowser.isolates</w:t>
+      </w:r>
+      <w:r>
+        <w:t xml:space="preserve">) for the assembly accession, since neither table carries both the MIC and</w:t>
+      </w:r>
+      <w:r>
+        <w:t xml:space="preserve"> </w:t>
+      </w:r>
+      <w:r>
+        <w:t xml:space="preserve">the accession. All</w:t>
+      </w:r>
+      <w:r>
+        <w:t xml:space="preserve"> </w:t>
+      </w:r>
+      <w:r>
+        <w:rPr>
+          <w:i/>
+        </w:rPr>
+        <w:t xml:space="preserve">K. pneumoniae</w:t>
+      </w:r>
+      <w:r>
+        <w:t xml:space="preserve"> </w:t>
+      </w:r>
+      <w:r>
+        <w:t xml:space="preserve">colistin results with an assembly accession were</w:t>
+      </w:r>
+      <w:r>
+        <w:t xml:space="preserve"> </w:t>
+      </w:r>
+      <w:r>
+        <w:t xml:space="preserve">retrieved.</w:t>
+      </w:r>
+    </w:p>
+    <w:p>
+      <w:pPr>
+        <w:pStyle w:val="BodyText"/>
+      </w:pPr>
+      <w:r>
+        <w:t xml:space="preserve">Because BV-BRC ingests from NCBI, overlap was removed before anything else: isolates matching our</w:t>
+      </w:r>
+      <w:r>
+        <w:t xml:space="preserve"> </w:t>
+      </w:r>
+      <w:r>
+        <w:t xml:space="preserve">cohort by BioSample accession, or by assembly accession ignoring the version suffix, were excluded.</w:t>
+      </w:r>
+      <w:r>
+        <w:t xml:space="preserve"> </w:t>
+      </w:r>
+      <w:r>
+        <w:t xml:space="preserve">Labels were re-derived from the submitted MIC under the same pinned EUCAST table used internally,</w:t>
+      </w:r>
+      <w:r>
+        <w:t xml:space="preserve"> </w:t>
+      </w:r>
+      <w:r>
+        <w:t xml:space="preserve">never taken from the submitted phenotype; isolates without a usable MIC were retained as a separate</w:t>
+      </w:r>
+      <w:r>
+        <w:t xml:space="preserve"> </w:t>
+      </w:r>
+      <w:r>
+        <w:t xml:space="preserve">stratum carrying the submitter’s own interpretation. Assemblies were downloaded from NCBI Datasets</w:t>
+      </w:r>
+      <w:r>
+        <w:t xml:space="preserve"> </w:t>
+      </w:r>
+      <w:r>
+        <w:t xml:space="preserve">and verified against each archive’s md5. AMRFinderPlus and Kleborate were run through the identical</w:t>
+      </w:r>
+      <w:r>
+        <w:t xml:space="preserve"> </w:t>
+      </w:r>
+      <w:r>
+        <w:t xml:space="preserve">pipeline code as the internal cohort, and the rules were imported unchanged from the analysis</w:t>
+      </w:r>
+      <w:r>
+        <w:t xml:space="preserve"> </w:t>
+      </w:r>
+      <w:r>
+        <w:t xml:space="preserve">module. Nothing was refitted, reselected or thresholded for this cohort, and the evaluation exposes</w:t>
+      </w:r>
+      <w:r>
+        <w:t xml:space="preserve"> </w:t>
+      </w:r>
+      <w:r>
+        <w:t xml:space="preserve">no parameter that could be.</w:t>
+      </w:r>
+    </w:p>
+    <w:p>
+      <w:pPr>
+        <w:pStyle w:val="Heading3"/>
+      </w:pPr>
+      <w:bookmarkStart w:id="41" w:name="reproducibility"/>
+      <w:r>
+        <w:t xml:space="preserve">2.11 Reproducibility</w:t>
+      </w:r>
+      <w:bookmarkEnd w:id="41"/>
+    </w:p>
+    <w:p>
+      <w:pPr>
+        <w:pStyle w:val="FirstParagraph"/>
+      </w:pPr>
+      <w:r>
+        <w:t xml:space="preserve">All analyses are deterministic for a fixed seed (20261024).</w:t>
       </w:r>
     </w:p>
     <w:p>
       <w:pPr>
         <w:pStyle w:val="Heading2"/>
       </w:pPr>
-      <w:bookmarkStart w:id="28" w:name="impact-statement"/>
-      <w:r>
-        <w:t xml:space="preserve">Impact Statement</w:t>
-      </w:r>
-      <w:bookmarkEnd w:id="28"/>
+      <w:bookmarkStart w:id="42" w:name="results"/>
+      <w:r>
+        <w:t xml:space="preserve">3. Results</w:t>
+      </w:r>
+      <w:bookmarkEnd w:id="42"/>
+    </w:p>
+    <w:p>
+      <w:pPr>
+        <w:pStyle w:val="Heading3"/>
+      </w:pPr>
+      <w:bookmarkStart w:id="43" w:name="cohort"/>
+      <w:r>
+        <w:t xml:space="preserve">3.1 Cohort</w:t>
+      </w:r>
+      <w:bookmarkEnd w:id="43"/>
     </w:p>
     <w:p>
       <w:pPr>
         <w:pStyle w:val="FirstParagraph"/>
       </w:pPr>
       <w:r>
-        <w:t xml:space="preserve">Genomic prediction of antimicrobial resistance is routinely evaluated by splitting genomes at</w:t>
-      </w:r>
-      <w:r>
-        <w:t xml:space="preserve"> </w:t>
-      </w:r>
-      <w:r>
-        <w:t xml:space="preserve">random, a design that places near-identical isolates on both sides of the split. This study shows,</w:t>
-      </w:r>
-      <w:r>
-        <w:t xml:space="preserve"> </w:t>
-      </w:r>
-      <w:r>
-        <w:t xml:space="preserve">for one well-defined mechanism, what that design conceals. A targeted check for disruption of</w:t>
-      </w:r>
-      <w:r>
-        <w:t xml:space="preserve"> </w:t>
-      </w:r>
-      <w:r>
-        <w:rPr>
-          <w:i/>
-        </w:rPr>
-        <w:t xml:space="preserve">mgrB</w:t>
-      </w:r>
-      <w:r>
-        <w:t xml:space="preserve"> </w:t>
-      </w:r>
-      <w:r>
-        <w:t xml:space="preserve">— the commonest route to colistin resistance in</w:t>
-      </w:r>
-      <w:r>
-        <w:t xml:space="preserve"> </w:t>
-      </w:r>
-      <w:r>
-        <w:rPr>
-          <w:i/>
-        </w:rPr>
-        <w:t xml:space="preserve">Klebsiella pneumoniae</w:t>
-      </w:r>
-      <w:r>
-        <w:t xml:space="preserve">, and one that</w:t>
-      </w:r>
-      <w:r>
-        <w:t xml:space="preserve"> </w:t>
-      </w:r>
-      <w:r>
-        <w:t xml:space="preserve">short-read assemblies systematically hide — recovers substantial sensitivity that gene screens</w:t>
-      </w:r>
-      <w:r>
-        <w:t xml:space="preserve"> </w:t>
-      </w:r>
-      <w:r>
-        <w:t xml:space="preserve">miss, yet the same unfitted rule varies from 39.5% to 70.6% sensitivity between public</w:t>
-      </w:r>
-      <w:r>
-        <w:t xml:space="preserve"> </w:t>
-      </w:r>
-      <w:r>
-        <w:t xml:space="preserve">collections. Machine-learning models outperform the rule under random splitting and fall below it</w:t>
-      </w:r>
-      <w:r>
-        <w:t xml:space="preserve"> </w:t>
-      </w:r>
-      <w:r>
-        <w:t xml:space="preserve">when lineages are held out. For anyone building or evaluating genomic resistance predictors, three</w:t>
-      </w:r>
-      <w:r>
-        <w:t xml:space="preserve"> </w:t>
-      </w:r>
-      <w:r>
-        <w:t xml:space="preserve">consequences follow: reported performance depends on validation design as much as on method;</w:t>
-      </w:r>
-      <w:r>
-        <w:t xml:space="preserve"> </w:t>
-      </w:r>
-      <w:r>
-        <w:t xml:space="preserve">study-aware and lineage-aware splits do not substitute for one another; and external validation on</w:t>
-      </w:r>
-      <w:r>
-        <w:t xml:space="preserve"> </w:t>
-      </w:r>
-      <w:r>
-        <w:t xml:space="preserve">a de-overlapped collection is achievable from public data.</w:t>
-      </w:r>
-    </w:p>
-    <w:p>
-      <w:pPr>
-        <w:pStyle w:val="Heading2"/>
-      </w:pPr>
-      <w:bookmarkStart w:id="29" w:name="introduction"/>
-      <w:r>
-        <w:t xml:space="preserve">1. Introduction</w:t>
-      </w:r>
-      <w:bookmarkEnd w:id="29"/>
-    </w:p>
-    <w:p>
-      <w:pPr>
-        <w:pStyle w:val="FirstParagraph"/>
-      </w:pPr>
-      <w:r>
-        <w:rPr>
-          <w:i/>
-        </w:rPr>
-        <w:t xml:space="preserve">Klebsiella pneumoniae</w:t>
-      </w:r>
-      <w:r>
-        <w:t xml:space="preserve"> </w:t>
-      </w:r>
-      <w:r>
-        <w:t xml:space="preserve">is among the bacterial pathogens responsible for the greatest number of</w:t>
-      </w:r>
-      <w:r>
-        <w:t xml:space="preserve"> </w:t>
-      </w:r>
-      <w:r>
-        <w:t xml:space="preserve">deaths attributable to antimicrobial resistance worldwide [1]. For most drug–organism</w:t>
-      </w:r>
-      <w:r>
-        <w:t xml:space="preserve"> </w:t>
-      </w:r>
-      <w:r>
-        <w:t xml:space="preserve">combinations in this species, resistance is conferred by acquired genes or well-characterised</w:t>
-      </w:r>
-      <w:r>
-        <w:t xml:space="preserve"> </w:t>
-      </w:r>
-      <w:r>
-        <w:t xml:space="preserve">target mutations, and tools such as AMRFinderPlus [2] and Kleborate [3] detect them reliably.</w:t>
-      </w:r>
-      <w:r>
-        <w:t xml:space="preserve"> </w:t>
-      </w:r>
-      <w:r>
-        <w:t xml:space="preserve">Colistin is the conspicuous exception, and the exception matters: colistin is a last-line agent</w:t>
-      </w:r>
-      <w:r>
-        <w:t xml:space="preserve"> </w:t>
-      </w:r>
-      <w:r>
-        <w:t xml:space="preserve">against carbapenem-resistant isolates [4], and resistance arises predominantly not from an</w:t>
-      </w:r>
-      <w:r>
-        <w:t xml:space="preserve"> </w:t>
-      </w:r>
-      <w:r>
-        <w:t xml:space="preserve">acquired gene but from loss of function of</w:t>
-      </w:r>
-      <w:r>
-        <w:t xml:space="preserve"> </w:t>
-      </w:r>
-      <w:r>
-        <w:rPr>
-          <w:i/>
-        </w:rPr>
-        <w:t xml:space="preserve">mgrB</w:t>
-      </w:r>
-      <w:r>
-        <w:t xml:space="preserve">, a 47-codon chromosomal gene encoding a negative</w:t>
-      </w:r>
-      <w:r>
-        <w:t xml:space="preserve"> </w:t>
-      </w:r>
-      <w:r>
-        <w:t xml:space="preserve">regulator of the PhoPQ two-component system. Loss of MgrB de-represses PhoPQ, modifying lipid A</w:t>
-      </w:r>
-      <w:r>
-        <w:t xml:space="preserve"> </w:t>
-      </w:r>
-      <w:r>
-        <w:t xml:space="preserve">and reducing colistin binding [4,5]. Plasmid-borne</w:t>
-      </w:r>
-      <w:r>
-        <w:t xml:space="preserve"> </w:t>
-      </w:r>
-      <w:r>
-        <w:rPr>
-          <w:i/>
-        </w:rPr>
-        <w:t xml:space="preserve">mcr</w:t>
-      </w:r>
-      <w:r>
-        <w:t xml:space="preserve"> </w:t>
-      </w:r>
-      <w:r>
-        <w:t xml:space="preserve">genes provide an acquired route and are globally disseminated [6], but account for a minority of</w:t>
-      </w:r>
-      <w:r>
-        <w:t xml:space="preserve"> </w:t>
-      </w:r>
-      <w:r>
-        <w:t xml:space="preserve">colistin-resistant</w:t>
-      </w:r>
-      <w:r>
-        <w:t xml:space="preserve"> </w:t>
-      </w:r>
-      <w:r>
-        <w:rPr>
-          <w:i/>
-        </w:rPr>
-        <w:t xml:space="preserve">K. pneumoniae</w:t>
-      </w:r>
-      <w:r>
-        <w:t xml:space="preserve">: in the external cohort of Section 3.10, 9 of 81 resistant isolates</w:t>
-      </w:r>
-      <w:r>
-        <w:t xml:space="preserve"> </w:t>
-      </w:r>
-      <w:r>
-        <w:t xml:space="preserve">carried one.</w:t>
-      </w:r>
-    </w:p>
-    <w:p>
-      <w:pPr>
-        <w:pStyle w:val="BodyText"/>
-      </w:pPr>
-      <w:r>
-        <w:t xml:space="preserve">The commonest route to</w:t>
-      </w:r>
-      <w:r>
-        <w:t xml:space="preserve"> </w:t>
-      </w:r>
-      <w:r>
-        <w:rPr>
-          <w:i/>
-        </w:rPr>
-        <w:t xml:space="preserve">mgrB</w:t>
-      </w:r>
-      <w:r>
-        <w:t xml:space="preserve"> </w:t>
-      </w:r>
-      <w:r>
-        <w:t xml:space="preserve">loss is insertion-sequence (IS) transposition into the gene [5], which</w:t>
-      </w:r>
-      <w:r>
-        <w:t xml:space="preserve"> </w:t>
-      </w:r>
-      <w:r>
-        <w:t xml:space="preserve">creates a specific detection problem. An IS element inserted into a 144-base-pair coding sequence</w:t>
-      </w:r>
-      <w:r>
-        <w:t xml:space="preserve"> </w:t>
-      </w:r>
-      <w:r>
-        <w:t xml:space="preserve">is typically longer than the repeat a short-read assembler can resolve, so the assembly breaks</w:t>
-      </w:r>
-      <w:r>
-        <w:t xml:space="preserve"> </w:t>
-      </w:r>
-      <w:r>
-        <w:t xml:space="preserve">inside</w:t>
-      </w:r>
-      <w:r>
-        <w:t xml:space="preserve"> </w:t>
-      </w:r>
-      <w:r>
-        <w:rPr>
-          <w:i/>
-        </w:rPr>
-        <w:t xml:space="preserve">mgrB</w:t>
-      </w:r>
-      <w:r>
-        <w:t xml:space="preserve">. A gene-presence screen finds no acquired colistin determinant; a point-mutation</w:t>
-      </w:r>
-      <w:r>
-        <w:t xml:space="preserve"> </w:t>
-      </w:r>
-      <w:r>
-        <w:t xml:space="preserve">screen finds no codon change, because the alignment simply ends. The genome appears wild type at</w:t>
-      </w:r>
-      <w:r>
-        <w:t xml:space="preserve"> </w:t>
-      </w:r>
-      <w:r>
-        <w:t xml:space="preserve">the one locus that matters.</w:t>
-      </w:r>
-    </w:p>
-    <w:p>
-      <w:pPr>
-        <w:pStyle w:val="BodyText"/>
-      </w:pPr>
-      <w:r>
-        <w:t xml:space="preserve">Two further issues complicate measuring how well genotype predicts phenotype on public data.</w:t>
-      </w:r>
-      <w:r>
-        <w:t xml:space="preserve"> </w:t>
-      </w:r>
-      <w:r>
-        <w:t xml:space="preserve">Deposited labels mix interpretive standards, so identical MICs can be reported susceptible under</w:t>
-      </w:r>
-      <w:r>
-        <w:t xml:space="preserve"> </w:t>
-      </w:r>
-      <w:r>
-        <w:t xml:space="preserve">one CLSI revision and resistant under EUCAST; colistin is especially exposed, because its</w:t>
-      </w:r>
-      <w:r>
-        <w:t xml:space="preserve"> </w:t>
-      </w:r>
-      <w:r>
-        <w:t xml:space="preserve">susceptibility testing is itself difficult and contested [4], and the resulting noise is easily</w:t>
-      </w:r>
-      <w:r>
-        <w:t xml:space="preserve"> </w:t>
-      </w:r>
-      <w:r>
-        <w:t xml:space="preserve">mistaken for genotype error. And public collections are dominated by outbreak investigations and surveys of</w:t>
-      </w:r>
-      <w:r>
-        <w:t xml:space="preserve"> </w:t>
-      </w:r>
-      <w:r>
-        <w:t xml:space="preserve">high-risk clones, so closely related isolates are abundant and random train/test splitting places</w:t>
-      </w:r>
-      <w:r>
-        <w:t xml:space="preserve"> </w:t>
-      </w:r>
-      <w:r>
-        <w:t xml:space="preserve">near-identical genomes on both sides. Yu and colleagues recently demonstrated across more than</w:t>
-      </w:r>
-      <w:r>
-        <w:t xml:space="preserve"> </w:t>
-      </w:r>
-      <w:r>
-        <w:t xml:space="preserve">24,000 genomes from five species that models trained this way substantially conflate lineage</w:t>
-      </w:r>
-      <w:r>
-        <w:t xml:space="preserve"> </w:t>
-      </w:r>
-      <w:r>
-        <w:t xml:space="preserve">markers with resistance determinants, and recommended comparison against rule-based baselines as</w:t>
-      </w:r>
-      <w:r>
-        <w:t xml:space="preserve"> </w:t>
-      </w:r>
-      <w:r>
-        <w:t xml:space="preserve">future work [7].</w:t>
-      </w:r>
-    </w:p>
-    <w:p>
-      <w:pPr>
-        <w:pStyle w:val="BodyText"/>
-      </w:pPr>
-      <w:r>
-        <w:t xml:space="preserve">Machine learning has been applied to this problem repeatedly, including MIC panel prediction for</w:t>
-      </w:r>
-      <w:r>
-        <w:t xml:space="preserve"> </w:t>
-      </w:r>
-      <w:r>
-        <w:rPr>
-          <w:i/>
-        </w:rPr>
-        <w:t xml:space="preserve">K. pneumoniae</w:t>
-      </w:r>
-      <w:r>
-        <w:t xml:space="preserve"> </w:t>
-      </w:r>
-      <w:r>
-        <w:t xml:space="preserve">[8], and has recently been benchmarked at scale: across 78 species–antibiotic</w:t>
-      </w:r>
-      <w:r>
-        <w:t xml:space="preserve"> </w:t>
-      </w:r>
-      <w:r>
-        <w:t xml:space="preserve">datasets, published predictors reached F1-macro ≥0.9 in 64% of randomly split experiments but only</w:t>
-      </w:r>
-      <w:r>
-        <w:t xml:space="preserve"> </w:t>
-      </w:r>
-      <w:r>
-        <w:t xml:space="preserve">25% when folds were made homology-aware, while a rule-based reference method performed best on the</w:t>
-      </w:r>
-      <w:r>
-        <w:t xml:space="preserve"> </w:t>
-      </w:r>
-      <w:r>
-        <w:t xml:space="preserve">most divergent genomes [9]. What that literature largely lacks is a mechanism-specified rule</w:t>
-      </w:r>
-      <w:r>
-        <w:t xml:space="preserve"> </w:t>
-      </w:r>
-      <w:r>
-        <w:t xml:space="preserve">baseline for a drug whose determinant is known but routinely missed, which is what makes colistin</w:t>
-      </w:r>
-      <w:r>
-        <w:t xml:space="preserve"> </w:t>
-      </w:r>
-      <w:r>
-        <w:t xml:space="preserve">the informative case.</w:t>
-      </w:r>
-    </w:p>
-    <w:p>
-      <w:pPr>
-        <w:pStyle w:val="BodyText"/>
-      </w:pPr>
-      <w:r>
-        <w:t xml:space="preserve">We take that recommendation as the design principle and ask a mechanism-level question: when a</w:t>
-      </w:r>
-      <w:r>
-        <w:t xml:space="preserve"> </w:t>
-      </w:r>
-      <w:r>
-        <w:t xml:space="preserve">resistance determinant is detectable but routinely missed, does supplying it to a rule outperform</w:t>
-      </w:r>
-      <w:r>
-        <w:t xml:space="preserve"> </w:t>
-      </w:r>
-      <w:r>
-        <w:t xml:space="preserve">letting a model find it, and does either transfer to new collections? We assemble a 6,652-genome</w:t>
-      </w:r>
-      <w:r>
-        <w:t xml:space="preserve"> </w:t>
-      </w:r>
-      <w:r>
-        <w:t xml:space="preserve">cohort with harmonised labels, add a targeted</w:t>
-      </w:r>
-      <w:r>
-        <w:t xml:space="preserve"> </w:t>
-      </w:r>
-      <w:r>
-        <w:rPr>
-          <w:i/>
-        </w:rPr>
-        <w:t xml:space="preserve">mgrB</w:t>
-      </w:r>
-      <w:r>
-        <w:t xml:space="preserve"> </w:t>
-      </w:r>
-      <w:r>
-        <w:t xml:space="preserve">check designed around the assembly-break</w:t>
-      </w:r>
-      <w:r>
-        <w:t xml:space="preserve"> </w:t>
-      </w:r>
-      <w:r>
-        <w:t xml:space="preserve">failure mode, and evaluate rules and models under progressively stricter validation.</w:t>
-      </w:r>
-    </w:p>
-    <w:p>
-      <w:pPr>
-        <w:pStyle w:val="Heading2"/>
-      </w:pPr>
-      <w:bookmarkStart w:id="30" w:name="methods"/>
-      <w:r>
-        <w:t xml:space="preserve">2. Methods</w:t>
-      </w:r>
-      <w:bookmarkEnd w:id="30"/>
-    </w:p>
-    <w:p>
-      <w:pPr>
-        <w:pStyle w:val="Heading3"/>
-      </w:pPr>
-      <w:bookmarkStart w:id="31" w:name="cohort-assembly-and-provenance"/>
-      <w:r>
-        <w:t xml:space="preserve">2.1 Cohort assembly and provenance</w:t>
-      </w:r>
-      <w:bookmarkEnd w:id="31"/>
-    </w:p>
-    <w:p>
-      <w:pPr>
-        <w:pStyle w:val="FirstParagraph"/>
-      </w:pPr>
-      <w:r>
-        <w:t xml:space="preserve">All</w:t>
-      </w:r>
-      <w:r>
-        <w:t xml:space="preserve"> </w:t>
-      </w:r>
-      <w:r>
-        <w:rPr>
-          <w:i/>
-        </w:rPr>
-        <w:t xml:space="preserve">K. pneumoniae</w:t>
-      </w:r>
-      <w:r>
-        <w:t xml:space="preserve"> </w:t>
-      </w:r>
-      <w:r>
-        <w:t xml:space="preserve">(taxon 573) AMR phenotype records were downloaded from the BV-BRC</w:t>
-      </w:r>
-      <w:r>
-        <w:t xml:space="preserve"> </w:t>
-      </w:r>
-      <w:r>
-        <w:rPr>
-          <w:rStyle w:val="VerbatimChar"/>
-        </w:rPr>
-        <w:t xml:space="preserve">genome_amr</w:t>
-      </w:r>
-      <w:r>
-        <w:t xml:space="preserve"> </w:t>
-      </w:r>
-      <w:r>
-        <w:t xml:space="preserve">endpoint (snapshot 2026-10-22; 1,840,793 records, 39,598 genomes). Retrieval re-run the following</w:t>
-      </w:r>
-      <w:r>
-        <w:t xml:space="preserve"> </w:t>
-      </w:r>
-      <w:r>
-        <w:t xml:space="preserve">day reproduced byte-identical output (SHA-256 d0e561a6…1505126). Every data pull writes a manifest</w:t>
-      </w:r>
-      <w:r>
-        <w:t xml:space="preserve"> </w:t>
-      </w:r>
-      <w:r>
-        <w:t xml:space="preserve">recording query, timestamp, record count and checksum.</w:t>
-      </w:r>
-    </w:p>
-    <w:p>
-      <w:pPr>
-        <w:pStyle w:val="BodyText"/>
-      </w:pPr>
-      <w:r>
-        <w:t xml:space="preserve">Only records with</w:t>
-      </w:r>
-      <w:r>
-        <w:t xml:space="preserve"> </w:t>
-      </w:r>
-      <w:r>
-        <w:rPr>
-          <w:rStyle w:val="VerbatimChar"/>
-        </w:rPr>
-        <w:t xml:space="preserve">evidence = "Laboratory Method"</w:t>
-      </w:r>
-      <w:r>
-        <w:t xml:space="preserve"> </w:t>
-      </w:r>
-      <w:r>
-        <w:t xml:space="preserve">were used as labels (85,291 records, 7,276</w:t>
-      </w:r>
-      <w:r>
-        <w:t xml:space="preserve"> </w:t>
-      </w:r>
-      <w:r>
-        <w:t xml:space="preserve">genomes); computational predictions deposited in the same database were excluded as circular.</w:t>
-      </w:r>
-    </w:p>
-    <w:p>
-      <w:pPr>
-        <w:pStyle w:val="Heading3"/>
-      </w:pPr>
-      <w:bookmarkStart w:id="32" w:name="label-harmonisation"/>
-      <w:r>
-        <w:t xml:space="preserve">2.2 Label harmonisation</w:t>
-      </w:r>
-      <w:bookmarkEnd w:id="32"/>
-    </w:p>
-    <w:p>
-      <w:pPr>
-        <w:pStyle w:val="FirstParagraph"/>
-      </w:pPr>
-      <w:r>
-        <w:t xml:space="preserve">Labels follow EUCAST Clinical Breakpoint Tables v16.1 [10]. Each record carrying an MIC was</w:t>
-      </w:r>
-      <w:r>
-        <w:t xml:space="preserve"> </w:t>
-      </w:r>
-      <w:r>
-        <w:t xml:space="preserve">re-interpreted (S if MIC ≤ s_le, R if MIC &gt; r_gt, else I) rather than accepting the deposited</w:t>
-      </w:r>
-      <w:r>
-        <w:t xml:space="preserve"> </w:t>
-      </w:r>
-      <w:r>
-        <w:t xml:space="preserve">call. Censored measurements that cannot be resolved against the breakpoint yield no label.</w:t>
-      </w:r>
-    </w:p>
-    <w:p>
-      <w:pPr>
-        <w:pStyle w:val="BodyText"/>
-      </w:pPr>
-      <w:r>
-        <w:t xml:space="preserve">This recovered substantial data: records deposited without an S/I/R call were uninterpreted</w:t>
-      </w:r>
-      <w:r>
-        <w:t xml:space="preserve"> </w:t>
-      </w:r>
-      <w:r>
-        <w:t xml:space="preserve">measurements rather than missing data, and re-interpretation added 1,921 labelled genomes for</w:t>
-      </w:r>
-      <w:r>
-        <w:t xml:space="preserve"> </w:t>
-      </w:r>
-      <w:r>
-        <w:t xml:space="preserve">meropenem, 959 for ciprofloxacin, 598 for colistin and 560 for gentamicin. It also resolved most</w:t>
-      </w:r>
-      <w:r>
-        <w:t xml:space="preserve"> </w:t>
-      </w:r>
-      <w:r>
-        <w:t xml:space="preserve">apparent contradictions — meropenem label conflicts fell from 60 genomes to 8 — because the</w:t>
-      </w:r>
-      <w:r>
-        <w:t xml:space="preserve"> </w:t>
-      </w:r>
-      <w:r>
-        <w:t xml:space="preserve">majority were the same genome interpreted under different standards by different studies. Where</w:t>
-      </w:r>
-      <w:r>
-        <w:t xml:space="preserve"> </w:t>
-      </w:r>
-      <w:r>
-        <w:t xml:space="preserve">both a deposited and a re-interpreted call existed they agreed in 92.9–97.2% of records.</w:t>
-      </w:r>
-    </w:p>
-    <w:p>
-      <w:pPr>
-        <w:pStyle w:val="BodyText"/>
-      </w:pPr>
-      <w:r>
-        <w:t xml:space="preserve">Three policies were fixed in advance and recorded as decision records in the repository:</w:t>
-      </w:r>
-      <w:r>
-        <w:t xml:space="preserve"> </w:t>
-      </w:r>
-      <w:r>
-        <w:t xml:space="preserve">intermediate and conflicting labels are excluded; colistin labels are restricted to broth</w:t>
-      </w:r>
-      <w:r>
-        <w:t xml:space="preserve"> </w:t>
-      </w:r>
-      <w:r>
-        <w:t xml:space="preserve">microdilution, the only method EUCAST accepts for colistin MICs; and study-level label sets judged</w:t>
-      </w:r>
-      <w:r>
-        <w:t xml:space="preserve"> </w:t>
-      </w:r>
-      <w:r>
-        <w:t xml:space="preserve">implausible on review are flagged and excluded with evidence recorded (one flag applied, Section 3.9).</w:t>
-      </w:r>
-      <w:r>
-        <w:t xml:space="preserve"> </w:t>
-      </w:r>
-      <w:r>
-        <w:t xml:space="preserve">Tigecycline has no EUCAST breakpoint for</w:t>
-      </w:r>
-      <w:r>
-        <w:t xml:space="preserve"> </w:t>
-      </w:r>
-      <w:r>
-        <w:rPr>
-          <w:i/>
-        </w:rPr>
-        <w:t xml:space="preserve">K. pneumoniae</w:t>
-      </w:r>
-      <w:r>
-        <w:t xml:space="preserve">, so deposited calls were used.</w:t>
-      </w:r>
-    </w:p>
-    <w:p>
-      <w:pPr>
-        <w:pStyle w:val="Heading3"/>
-      </w:pPr>
-      <w:bookmarkStart w:id="33" w:name="assembly-quality-control-and-genotyping"/>
-      <w:r>
-        <w:t xml:space="preserve">2.3 Assembly quality control and genotyping</w:t>
-      </w:r>
-      <w:bookmarkEnd w:id="33"/>
-    </w:p>
-    <w:p>
-      <w:pPr>
-        <w:pStyle w:val="FirstParagraph"/>
-      </w:pPr>
-      <w:r>
-        <w:t xml:space="preserve">Assemblies were required to be</w:t>
-      </w:r>
-      <w:r>
-        <w:t xml:space="preserve"> </w:t>
-      </w:r>
-      <w:r>
-        <w:rPr>
-          <w:i/>
-        </w:rPr>
-        <w:t xml:space="preserve">K. pneumoniae</w:t>
-      </w:r>
-      <w:r>
-        <w:t xml:space="preserve"> </w:t>
-      </w:r>
-      <w:r>
-        <w:t xml:space="preserve">by both species field and genome name, 5.0–6.5 Mb,</w:t>
-      </w:r>
-      <w:r>
-        <w:t xml:space="preserve"> </w:t>
-      </w:r>
-      <w:r>
-        <w:t xml:space="preserve">≤500 contigs, N50 ≥20 kb, CheckM [11] completeness ≥95% and contamination ≤5%. Agreement between</w:t>
-      </w:r>
-      <w:r>
-        <w:t xml:space="preserve"> </w:t>
-      </w:r>
-      <w:r>
-        <w:t xml:space="preserve">the species field and the genome name was required, so that internally inconsistent BV-BRC records</w:t>
-      </w:r>
-      <w:r>
-        <w:t xml:space="preserve"> </w:t>
-      </w:r>
-      <w:r>
-        <w:t xml:space="preserve">are excluded.</w:t>
-      </w:r>
-    </w:p>
-    <w:p>
-      <w:pPr>
-        <w:pStyle w:val="BodyText"/>
-      </w:pPr>
-      <w:r>
-        <w:t xml:space="preserve">Assemblies were downloaded from BV-BRC [12] by genome identifier rather than by NCBI assembly</w:t>
-      </w:r>
-      <w:r>
-        <w:t xml:space="preserve"> </w:t>
-      </w:r>
-      <w:r>
-        <w:t xml:space="preserve">accession, because many QC-passing genomes carry no such accession, and were validated for format</w:t>
-      </w:r>
-      <w:r>
-        <w:t xml:space="preserve"> </w:t>
-      </w:r>
-      <w:r>
-        <w:t xml:space="preserve">and length. AMRFinderPlus 4.2.7 [2] (database 2026-08-07.1) was run in nucleotide mode with</w:t>
-      </w:r>
-      <w:r>
-        <w:t xml:space="preserve"> </w:t>
-      </w:r>
-      <w:r>
-        <w:rPr>
-          <w:rStyle w:val="VerbatimChar"/>
-        </w:rPr>
-        <w:t xml:space="preserve">--organism Klebsiella_pneumoniae --plus</w:t>
-      </w:r>
-      <w:r>
-        <w:t xml:space="preserve">, and Kleborate 3.2.4 [3] with Kaptive 3.2.2 [13] using</w:t>
-      </w:r>
-      <w:r>
-        <w:t xml:space="preserve"> </w:t>
-      </w:r>
-      <w:r>
-        <w:t xml:space="preserve">the</w:t>
-      </w:r>
-      <w:r>
-        <w:t xml:space="preserve"> </w:t>
-      </w:r>
-      <w:r>
-        <w:rPr>
-          <w:rStyle w:val="VerbatimChar"/>
-        </w:rPr>
-        <w:t xml:space="preserve">kpsc</w:t>
-      </w:r>
-      <w:r>
-        <w:t xml:space="preserve"> </w:t>
-      </w:r>
-      <w:r>
-        <w:t xml:space="preserve">preset. A cross-machine verification script reproduces identical calls on macOS arm64</w:t>
-      </w:r>
-      <w:r>
-        <w:t xml:space="preserve"> </w:t>
-      </w:r>
-      <w:r>
-        <w:t xml:space="preserve">and Ubuntu x86_64.</w:t>
-      </w:r>
-    </w:p>
-    <w:p>
-      <w:pPr>
-        <w:pStyle w:val="Heading3"/>
-      </w:pPr>
-      <w:bookmarkStart w:id="34" w:name="rule-based-prediction"/>
-      <w:r>
-        <w:t xml:space="preserve">2.4 Rule-based prediction</w:t>
-      </w:r>
-      <w:bookmarkEnd w:id="34"/>
-    </w:p>
-    <w:p>
-      <w:pPr>
-        <w:pStyle w:val="FirstParagraph"/>
-      </w:pPr>
-      <w:r>
-        <w:t xml:space="preserve">Per-drug rules were specified from tool output before phenotype comparison: acquired carbapenemase</w:t>
-      </w:r>
-      <w:r>
-        <w:t xml:space="preserve"> </w:t>
-      </w:r>
-      <w:r>
-        <w:t xml:space="preserve">for meropenem; QRDR mutation or acquired quinolone gene for ciprofloxacin; aminoglycoside-modifying</w:t>
-      </w:r>
-      <w:r>
-        <w:t xml:space="preserve"> </w:t>
-      </w:r>
-      <w:r>
-        <w:t xml:space="preserve">enzyme or 16S rRNA methyltransferase for gentamicin;</w:t>
-      </w:r>
-      <w:r>
-        <w:t xml:space="preserve"> </w:t>
-      </w:r>
-      <w:r>
-        <w:rPr>
-          <w:i/>
-        </w:rPr>
-        <w:t xml:space="preserve">mcr</w:t>
-      </w:r>
-      <w:r>
-        <w:t xml:space="preserve"> </w:t>
-      </w:r>
-      <w:r>
-        <w:t xml:space="preserve">or</w:t>
-      </w:r>
-      <w:r>
-        <w:t xml:space="preserve"> </w:t>
-      </w:r>
-      <w:r>
-        <w:rPr>
-          <w:i/>
-        </w:rPr>
-        <w:t xml:space="preserve">mgrB</w:t>
-      </w:r>
-      <w:r>
-        <w:t xml:space="preserve">/</w:t>
-      </w:r>
-      <w:r>
-        <w:rPr>
-          <w:i/>
-        </w:rPr>
-        <w:t xml:space="preserve">pmrAB</w:t>
-      </w:r>
-      <w:r>
-        <w:t xml:space="preserve">/</w:t>
-      </w:r>
-      <w:r>
-        <w:rPr>
-          <w:i/>
-        </w:rPr>
-        <w:t xml:space="preserve">phoPQ</w:t>
-      </w:r>
-      <w:r>
-        <w:t xml:space="preserve"> </w:t>
-      </w:r>
-      <w:r>
-        <w:t xml:space="preserve">determinants</w:t>
-      </w:r>
-      <w:r>
-        <w:t xml:space="preserve"> </w:t>
-      </w:r>
-      <w:r>
-        <w:t xml:space="preserve">for colistin; acquired</w:t>
-      </w:r>
-      <w:r>
-        <w:t xml:space="preserve"> </w:t>
-      </w:r>
-      <w:r>
-        <w:rPr>
-          <w:i/>
-        </w:rPr>
-        <w:t xml:space="preserve">tet(X)</w:t>
-      </w:r>
-      <w:r>
-        <w:t xml:space="preserve"> </w:t>
-      </w:r>
-      <w:r>
-        <w:t xml:space="preserve">or</w:t>
-      </w:r>
-      <w:r>
-        <w:t xml:space="preserve"> </w:t>
-      </w:r>
-      <w:r>
-        <w:rPr>
-          <w:i/>
-        </w:rPr>
-        <w:t xml:space="preserve">tmexCD-toprJ</w:t>
-      </w:r>
-      <w:r>
-        <w:t xml:space="preserve"> </w:t>
-      </w:r>
-      <w:r>
-        <w:t xml:space="preserve">for tigecycline.</w:t>
-      </w:r>
-    </w:p>
-    <w:p>
-      <w:pPr>
-        <w:pStyle w:val="BodyText"/>
-      </w:pPr>
-      <w:r>
-        <w:t xml:space="preserve">Two corrections were applied after a 524-genome pilot, both tool-annotation artefacts rather than</w:t>
-      </w:r>
-      <w:r>
-        <w:t xml:space="preserve"> </w:t>
-      </w:r>
-      <w:r>
-        <w:t xml:space="preserve">biology. AMRFinderPlus assigns the intrinsic chromosomal</w:t>
-      </w:r>
-      <w:r>
-        <w:t xml:space="preserve"> </w:t>
-      </w:r>
-      <w:r>
-        <w:rPr>
-          <w:i/>
-        </w:rPr>
-        <w:t xml:space="preserve">oqxAB</w:t>
-      </w:r>
-      <w:r>
-        <w:t xml:space="preserve"> </w:t>
-      </w:r>
-      <w:r>
-        <w:t xml:space="preserve">pump to tigecycline as well as</w:t>
-      </w:r>
-      <w:r>
-        <w:t xml:space="preserve"> </w:t>
-      </w:r>
-      <w:r>
-        <w:t xml:space="preserve">quinolones; since essentially all</w:t>
-      </w:r>
-      <w:r>
-        <w:t xml:space="preserve"> </w:t>
-      </w:r>
-      <w:r>
-        <w:rPr>
-          <w:i/>
-        </w:rPr>
-        <w:t xml:space="preserve">K. pneumoniae</w:t>
-      </w:r>
-      <w:r>
-        <w:t xml:space="preserve"> </w:t>
-      </w:r>
-      <w:r>
-        <w:t xml:space="preserve">carry</w:t>
-      </w:r>
-      <w:r>
-        <w:t xml:space="preserve"> </w:t>
-      </w:r>
-      <w:r>
-        <w:rPr>
-          <w:i/>
-        </w:rPr>
-        <w:t xml:space="preserve">oqxAB</w:t>
-      </w:r>
-      <w:r>
-        <w:t xml:space="preserve"> </w:t>
-      </w:r>
-      <w:r>
-        <w:t xml:space="preserve">this produced 88 of 91 pilot</w:t>
-      </w:r>
-      <w:r>
-        <w:t xml:space="preserve"> </w:t>
-      </w:r>
-      <w:r>
-        <w:t xml:space="preserve">tigecycline false positives, and</w:t>
-      </w:r>
-      <w:r>
-        <w:t xml:space="preserve"> </w:t>
-      </w:r>
-      <w:r>
-        <w:rPr>
-          <w:i/>
-        </w:rPr>
-        <w:t xml:space="preserve">oqxAB</w:t>
-      </w:r>
-      <w:r>
-        <w:t xml:space="preserve"> </w:t>
-      </w:r>
-      <w:r>
-        <w:t xml:space="preserve">is now excluded for all drugs. Efflux-regulator variants</w:t>
-      </w:r>
-      <w:r>
-        <w:t xml:space="preserve"> </w:t>
-      </w:r>
-      <w:r>
-        <w:t xml:space="preserve">(</w:t>
-      </w:r>
-      <w:r>
-        <w:rPr>
-          <w:i/>
-        </w:rPr>
-        <w:t xml:space="preserve">oqxR</w:t>
-      </w:r>
-      <w:r>
-        <w:t xml:space="preserve">,</w:t>
-      </w:r>
-      <w:r>
-        <w:t xml:space="preserve"> </w:t>
-      </w:r>
-      <w:r>
-        <w:rPr>
-          <w:i/>
-        </w:rPr>
-        <w:t xml:space="preserve">ramR</w:t>
-      </w:r>
-      <w:r>
-        <w:t xml:space="preserve">,</w:t>
-      </w:r>
-      <w:r>
-        <w:t xml:space="preserve"> </w:t>
-      </w:r>
-      <w:r>
-        <w:rPr>
-          <w:i/>
-        </w:rPr>
-        <w:t xml:space="preserve">acrR</w:t>
-      </w:r>
-      <w:r>
-        <w:t xml:space="preserve">) produced 21 of 26 pilot ciprofloxacin false positives and are reported as</w:t>
-      </w:r>
-      <w:r>
-        <w:t xml:space="preserve"> </w:t>
-      </w:r>
-      <w:r>
-        <w:t xml:space="preserve">a separate tier rather than folded into the core rule.</w:t>
-      </w:r>
-    </w:p>
-    <w:p>
-      <w:pPr>
-        <w:pStyle w:val="Heading3"/>
-      </w:pPr>
-      <w:bookmarkStart w:id="35" w:name="targeted-mgrb-integrity-check"/>
-      <w:r>
-        <w:t xml:space="preserve">2.5 Targeted</w:t>
-      </w:r>
-      <w:r>
-        <w:t xml:space="preserve"> </w:t>
-      </w:r>
-      <w:r>
-        <w:rPr>
-          <w:i/>
-        </w:rPr>
-        <w:t xml:space="preserve">mgrB</w:t>
-      </w:r>
-      <w:r>
-        <w:t xml:space="preserve"> </w:t>
-      </w:r>
-      <w:r>
-        <w:t xml:space="preserve">integrity check</w:t>
-      </w:r>
-      <w:bookmarkEnd w:id="35"/>
-    </w:p>
-    <w:p>
-      <w:pPr>
-        <w:pStyle w:val="FirstParagraph"/>
-      </w:pPr>
-      <w:r>
-        <w:t xml:space="preserve">The MgrB reference protein (WP_002911375.1, 47 aa) was searched against each assembly with tblastn [14]</w:t>
-      </w:r>
-      <w:r>
-        <w:t xml:space="preserve"> </w:t>
-      </w:r>
-      <w:r>
-        <w:t xml:space="preserve">(e-value ≤1e-5, hits ≥10 aa) and the best hit classified as</w:t>
-      </w:r>
-      <w:r>
-        <w:t xml:space="preserve"> </w:t>
-      </w:r>
-      <w:r>
-        <w:rPr>
-          <w:b/>
-        </w:rPr>
-        <w:t xml:space="preserve">intact</w:t>
-      </w:r>
-      <w:r>
-        <w:t xml:space="preserve"> </w:t>
-      </w:r>
-      <w:r>
-        <w:t xml:space="preserve">(full-length, no residue</w:t>
-      </w:r>
-      <w:r>
-        <w:t xml:space="preserve"> </w:t>
-      </w:r>
-      <w:r>
-        <w:t xml:space="preserve">differences);</w:t>
-      </w:r>
-      <w:r>
-        <w:t xml:space="preserve"> </w:t>
-      </w:r>
-      <w:r>
-        <w:rPr>
-          <w:b/>
-        </w:rPr>
-        <w:t xml:space="preserve">missense</w:t>
-      </w:r>
-      <w:r>
-        <w:t xml:space="preserve"> </w:t>
-      </w:r>
-      <w:r>
-        <w:t xml:space="preserve">(full-length with substitutions);</w:t>
-      </w:r>
-      <w:r>
-        <w:t xml:space="preserve"> </w:t>
-      </w:r>
-      <w:r>
-        <w:rPr>
-          <w:b/>
-        </w:rPr>
-        <w:t xml:space="preserve">premature_stop</w:t>
-      </w:r>
-      <w:r>
-        <w:t xml:space="preserve">;</w:t>
-      </w:r>
-      <w:r>
-        <w:t xml:space="preserve"> </w:t>
-      </w:r>
-      <w:r>
-        <w:rPr>
-          <w:b/>
-        </w:rPr>
-        <w:t xml:space="preserve">frameshift_or_indel</w:t>
-      </w:r>
-      <w:r>
-        <w:t xml:space="preserve"> </w:t>
-      </w:r>
-      <w:r>
-        <w:t xml:space="preserve">(two fragments on one contig &lt;300 bp apart);</w:t>
-      </w:r>
-      <w:r>
-        <w:t xml:space="preserve"> </w:t>
-      </w:r>
-      <w:r>
-        <w:rPr>
-          <w:b/>
-        </w:rPr>
-        <w:t xml:space="preserve">insertion_assembled</w:t>
-      </w:r>
-      <w:r>
-        <w:t xml:space="preserve"> </w:t>
-      </w:r>
-      <w:r>
-        <w:t xml:space="preserve">(two</w:t>
-      </w:r>
-      <w:r>
-        <w:t xml:space="preserve"> </w:t>
-      </w:r>
-      <w:r>
-        <w:t xml:space="preserve">fragments &gt;300 bp apart);</w:t>
-      </w:r>
-      <w:r>
-        <w:t xml:space="preserve"> </w:t>
-      </w:r>
-      <w:r>
-        <w:rPr>
-          <w:b/>
-        </w:rPr>
-        <w:t xml:space="preserve">split_contigs</w:t>
-      </w:r>
-      <w:r>
-        <w:t xml:space="preserve">;</w:t>
-      </w:r>
-      <w:r>
-        <w:t xml:space="preserve"> </w:t>
-      </w:r>
-      <w:r>
-        <w:rPr>
-          <w:b/>
-        </w:rPr>
-        <w:t xml:space="preserve">contig_break</w:t>
-      </w:r>
-      <w:r>
-        <w:t xml:space="preserve"> </w:t>
-      </w:r>
-      <w:r>
-        <w:t xml:space="preserve">(alignment terminating at a contig</w:t>
-      </w:r>
-      <w:r>
-        <w:t xml:space="preserve"> </w:t>
-      </w:r>
-      <w:r>
-        <w:t xml:space="preserve">edge);</w:t>
-      </w:r>
-      <w:r>
-        <w:t xml:space="preserve"> </w:t>
-      </w:r>
-      <w:r>
-        <w:rPr>
-          <w:b/>
-        </w:rPr>
-        <w:t xml:space="preserve">partial</w:t>
-      </w:r>
-      <w:r>
-        <w:t xml:space="preserve">; or</w:t>
-      </w:r>
-      <w:r>
-        <w:t xml:space="preserve"> </w:t>
-      </w:r>
-      <w:r>
-        <w:rPr>
-          <w:b/>
-        </w:rPr>
-        <w:t xml:space="preserve">absent</w:t>
-      </w:r>
-      <w:r>
-        <w:t xml:space="preserve">. All categories except intact and missense count as disrupted.</w:t>
-      </w:r>
-      <w:r>
-        <w:t xml:space="preserve"> </w:t>
-      </w:r>
-      <w:r>
-        <w:t xml:space="preserve">The</w:t>
-      </w:r>
-      <w:r>
-        <w:t xml:space="preserve"> </w:t>
-      </w:r>
-      <w:r>
-        <w:rPr>
-          <w:rStyle w:val="VerbatimChar"/>
-        </w:rPr>
-        <w:t xml:space="preserve">split_contigs</w:t>
-      </w:r>
-      <w:r>
-        <w:t xml:space="preserve">,</w:t>
-      </w:r>
-      <w:r>
-        <w:t xml:space="preserve"> </w:t>
-      </w:r>
-      <w:r>
-        <w:rPr>
-          <w:rStyle w:val="VerbatimChar"/>
-        </w:rPr>
-        <w:t xml:space="preserve">contig_break</w:t>
-      </w:r>
-      <w:r>
-        <w:t xml:space="preserve"> </w:t>
-      </w:r>
-      <w:r>
-        <w:t xml:space="preserve">and</w:t>
-      </w:r>
-      <w:r>
-        <w:t xml:space="preserve"> </w:t>
-      </w:r>
-      <w:r>
-        <w:rPr>
-          <w:rStyle w:val="VerbatimChar"/>
-        </w:rPr>
-        <w:t xml:space="preserve">partial</w:t>
-      </w:r>
-      <w:r>
-        <w:t xml:space="preserve"> </w:t>
-      </w:r>
-      <w:r>
-        <w:t xml:space="preserve">categories are the assembly signature described</w:t>
-      </w:r>
-      <w:r>
-        <w:t xml:space="preserve"> </w:t>
-      </w:r>
-      <w:r>
-        <w:t xml:space="preserve">in Section 1.</w:t>
-      </w:r>
-    </w:p>
-    <w:p>
-      <w:pPr>
-        <w:pStyle w:val="BodyText"/>
-      </w:pPr>
-      <w:r>
-        <w:t xml:space="preserve">Residue differences are enumerated by direct comparison of aligned sequences, ignoring query</w:t>
-      </w:r>
-      <w:r>
-        <w:t xml:space="preserve"> </w:t>
-      </w:r>
-      <w:r>
-        <w:t xml:space="preserve">position 1, because tblastn translates alternative start codons (GTG, TTG) as V or L rather than</w:t>
-      </w:r>
-      <w:r>
-        <w:t xml:space="preserve"> </w:t>
-      </w:r>
-      <w:r>
-        <w:t xml:space="preserve">M. Classifying variants by percentage identity instead produces a systematic artefact at the start</w:t>
-      </w:r>
-      <w:r>
-        <w:t xml:space="preserve"> </w:t>
-      </w:r>
-      <w:r>
-        <w:t xml:space="preserve">codon, quantified in Section 3.3.</w:t>
-      </w:r>
-    </w:p>
-    <w:p>
-      <w:pPr>
-        <w:pStyle w:val="Heading3"/>
-      </w:pPr>
-      <w:bookmarkStart w:id="36" w:name="Xfcd1d0cf32165564d5133920c147139c7c0f246"/>
-      <w:r>
-        <w:t xml:space="preserve">2.6 Testing the insertion-sequence interpretation</w:t>
-      </w:r>
-      <w:bookmarkEnd w:id="36"/>
-    </w:p>
-    <w:p>
-      <w:pPr>
-        <w:pStyle w:val="FirstParagraph"/>
-      </w:pPr>
-      <w:r>
-        <w:t xml:space="preserve">The</w:t>
-      </w:r>
-      <w:r>
-        <w:t xml:space="preserve"> </w:t>
-      </w:r>
-      <w:r>
-        <w:rPr>
-          <w:rStyle w:val="VerbatimChar"/>
-        </w:rPr>
-        <w:t xml:space="preserve">split_contigs</w:t>
-      </w:r>
-      <w:r>
-        <w:t xml:space="preserve">,</w:t>
-      </w:r>
-      <w:r>
-        <w:t xml:space="preserve"> </w:t>
-      </w:r>
-      <w:r>
-        <w:rPr>
-          <w:rStyle w:val="VerbatimChar"/>
-        </w:rPr>
-        <w:t xml:space="preserve">contig_break</w:t>
-      </w:r>
-      <w:r>
-        <w:t xml:space="preserve"> </w:t>
-      </w:r>
-      <w:r>
-        <w:t xml:space="preserve">and</w:t>
-      </w:r>
-      <w:r>
-        <w:t xml:space="preserve"> </w:t>
-      </w:r>
-      <w:r>
-        <w:rPr>
-          <w:rStyle w:val="VerbatimChar"/>
-        </w:rPr>
-        <w:t xml:space="preserve">partial</w:t>
-      </w:r>
-      <w:r>
-        <w:t xml:space="preserve"> </w:t>
-      </w:r>
-      <w:r>
-        <w:t xml:space="preserve">categories are inferences from assembly</w:t>
-      </w:r>
-      <w:r>
-        <w:t xml:space="preserve"> </w:t>
-      </w:r>
-      <w:r>
-        <w:t xml:space="preserve">structure, so we tested three predictions that follow from IS insertion but not from incidental</w:t>
-      </w:r>
-      <w:r>
-        <w:t xml:space="preserve"> </w:t>
-      </w:r>
-      <w:r>
-        <w:t xml:space="preserve">fragmentation. First, position: the break should coincide with</w:t>
-      </w:r>
-      <w:r>
-        <w:t xml:space="preserve"> </w:t>
-      </w:r>
-      <w:r>
-        <w:rPr>
-          <w:i/>
-        </w:rPr>
-        <w:t xml:space="preserve">mgrB</w:t>
-      </w:r>
-      <w:r>
-        <w:t xml:space="preserve">, compared against genomes</w:t>
-      </w:r>
-      <w:r>
-        <w:t xml:space="preserve"> </w:t>
-      </w:r>
-      <w:r>
-        <w:t xml:space="preserve">with intact</w:t>
-      </w:r>
-      <w:r>
-        <w:t xml:space="preserve"> </w:t>
-      </w:r>
-      <w:r>
-        <w:rPr>
-          <w:i/>
-        </w:rPr>
-        <w:t xml:space="preserve">mgrB</w:t>
-      </w:r>
-      <w:r>
-        <w:t xml:space="preserve">. Second, repetitiveness: sequence at the</w:t>
-      </w:r>
-      <w:r>
-        <w:t xml:space="preserve"> </w:t>
-      </w:r>
-      <w:r>
-        <w:rPr>
-          <w:i/>
-        </w:rPr>
-        <w:t xml:space="preserve">mgrB</w:t>
-      </w:r>
-      <w:r>
-        <w:t xml:space="preserve">-adjacent contig end should have</w:t>
-      </w:r>
-      <w:r>
-        <w:t xml:space="preserve"> </w:t>
-      </w:r>
-      <w:r>
-        <w:t xml:space="preserve">copies elsewhere in the same assembly. Because contig ends are repeat-enriched in general, this was</w:t>
-      </w:r>
-      <w:r>
-        <w:t xml:space="preserve"> </w:t>
-      </w:r>
-      <w:r>
-        <w:t xml:space="preserve">compared against randomly chosen other contig ends in the same assemblies, truncated to the same</w:t>
-      </w:r>
-      <w:r>
-        <w:t xml:space="preserve"> </w:t>
-      </w:r>
-      <w:r>
-        <w:t xml:space="preserve">length as each genome’s</w:t>
-      </w:r>
-      <w:r>
-        <w:t xml:space="preserve"> </w:t>
-      </w:r>
-      <w:r>
-        <w:rPr>
-          <w:i/>
-        </w:rPr>
-        <w:t xml:space="preserve">mgrB</w:t>
-      </w:r>
-      <w:r>
-        <w:t xml:space="preserve"> </w:t>
-      </w:r>
-      <w:r>
-        <w:t xml:space="preserve">flank. Third, recurrence: the same sequences should appear at</w:t>
-      </w:r>
-      <w:r>
-        <w:t xml:space="preserve"> </w:t>
-      </w:r>
-      <w:r>
-        <w:rPr>
-          <w:i/>
-        </w:rPr>
-        <w:t xml:space="preserve">mgrB</w:t>
-      </w:r>
-      <w:r>
-        <w:t xml:space="preserve"> </w:t>
-      </w:r>
-      <w:r>
-        <w:t xml:space="preserve">in unrelated isolates. Flanks were taken as up to 600 bp of contig end adjacent to</w:t>
-      </w:r>
-      <w:r>
-        <w:t xml:space="preserve"> </w:t>
-      </w:r>
-      <w:r>
-        <w:rPr>
-          <w:i/>
-        </w:rPr>
-        <w:t xml:space="preserve">mgrB</w:t>
-      </w:r>
-      <w:r>
-        <w:t xml:space="preserve"> </w:t>
-      </w:r>
-      <w:r>
-        <w:t xml:space="preserve">(minimum</w:t>
-      </w:r>
-      <w:r>
-        <w:t xml:space="preserve"> </w:t>
-      </w:r>
-      <w:r>
-        <w:t xml:space="preserve">50 bp) and compared by blastn at ≥95% identity (within genome) or ≥90% (between genomes) over ≥80%</w:t>
-      </w:r>
-      <w:r>
-        <w:t xml:space="preserve"> </w:t>
-      </w:r>
-      <w:r>
-        <w:t xml:space="preserve">of the flank.</w:t>
-      </w:r>
-    </w:p>
-    <w:p>
-      <w:pPr>
-        <w:pStyle w:val="Heading3"/>
-      </w:pPr>
-      <w:bookmarkStart w:id="37" w:name="validating-the-mgrb-rule"/>
-      <w:r>
-        <w:t xml:space="preserve">2.7 Validating the</w:t>
-      </w:r>
-      <w:r>
-        <w:t xml:space="preserve"> </w:t>
-      </w:r>
-      <w:r>
-        <w:rPr>
-          <w:i/>
-        </w:rPr>
-        <w:t xml:space="preserve">mgrB</w:t>
-      </w:r>
-      <w:r>
-        <w:t xml:space="preserve"> </w:t>
-      </w:r>
-      <w:r>
-        <w:t xml:space="preserve">rule</w:t>
-      </w:r>
-      <w:bookmarkEnd w:id="37"/>
-    </w:p>
-    <w:p>
-      <w:pPr>
-        <w:pStyle w:val="FirstParagraph"/>
-      </w:pPr>
-      <w:r>
-        <w:t xml:space="preserve">Because three disruption categories are inferred from assembly structure, we tested whether the</w:t>
-      </w:r>
-      <w:r>
-        <w:t xml:space="preserve"> </w:t>
-      </w:r>
-      <w:r>
-        <w:t xml:space="preserve">association with phenotype could reflect assembly fragmentation by comparing contig counts and N50</w:t>
-      </w:r>
-      <w:r>
-        <w:t xml:space="preserve"> </w:t>
-      </w:r>
-      <w:r>
-        <w:t xml:space="preserve">between calls, and by stratifying the colistin association on assembly-quality quartile.</w:t>
-      </w:r>
-    </w:p>
-    <w:p>
-      <w:pPr>
-        <w:pStyle w:val="BodyText"/>
-      </w:pPr>
-      <w:r>
-        <w:t xml:space="preserve">Because the decision to treat missense variants as resistance-predicting was made after observing</w:t>
-      </w:r>
-      <w:r>
-        <w:t xml:space="preserve"> </w:t>
-      </w:r>
-      <w:r>
-        <w:t xml:space="preserve">their enrichment in this cohort, we re-estimated that tier by leave-one-study-out: variants were</w:t>
-      </w:r>
-      <w:r>
-        <w:t xml:space="preserve"> </w:t>
-      </w:r>
-      <w:r>
-        <w:t xml:space="preserve">selected on training studies only (≥3 genomes, &gt;50% resistant) and applied to the held-out study.</w:t>
-      </w:r>
-      <w:r>
-        <w:t xml:space="preserve"> </w:t>
-      </w:r>
-      <w:r>
-        <w:t xml:space="preserve">The disruption tier, being mechanism-specified and fitted to nothing, was evaluated in the same</w:t>
-      </w:r>
-      <w:r>
-        <w:t xml:space="preserve"> </w:t>
-      </w:r>
-      <w:r>
-        <w:t xml:space="preserve">framework for comparison.</w:t>
-      </w:r>
-    </w:p>
-    <w:p>
-      <w:pPr>
-        <w:pStyle w:val="Heading3"/>
-      </w:pPr>
-      <w:bookmarkStart w:id="38" w:name="attributing-performance-to-lineage"/>
-      <w:r>
-        <w:t xml:space="preserve">2.8 Attributing performance to lineage</w:t>
-      </w:r>
-      <w:bookmarkEnd w:id="38"/>
-    </w:p>
-    <w:p>
-      <w:pPr>
-        <w:pStyle w:val="FirstParagraph"/>
-      </w:pPr>
-      <w:r>
-        <w:t xml:space="preserve">To test directly, rather than infer, how much performance is obtainable from lineage, we built a</w:t>
-      </w:r>
-      <w:r>
-        <w:t xml:space="preserve"> </w:t>
-      </w:r>
-      <w:r>
-        <w:t xml:space="preserve">predictor using sequence type alone: for each test genome it returns the majority label of that</w:t>
-      </w:r>
-      <w:r>
-        <w:t xml:space="preserve"> </w:t>
-      </w:r>
-      <w:r>
-        <w:t xml:space="preserve">genome’s sequence type among training genomes, falling back to the overall training majority when</w:t>
-      </w:r>
-      <w:r>
-        <w:t xml:space="preserve"> </w:t>
-      </w:r>
-      <w:r>
-        <w:t xml:space="preserve">the type is unseen. It uses no resistance determinant. We also measured, for each split scheme,</w:t>
-      </w:r>
-      <w:r>
-        <w:t xml:space="preserve"> </w:t>
-      </w:r>
-      <w:r>
-        <w:t xml:space="preserve">the fraction of test genomes sharing a sequence type or a BioProject with any training genome.</w:t>
-      </w:r>
-    </w:p>
-    <w:p>
-      <w:pPr>
-        <w:pStyle w:val="Heading3"/>
-      </w:pPr>
-      <w:bookmarkStart w:id="39" w:name="benchmark"/>
-      <w:r>
-        <w:t xml:space="preserve">2.9 Benchmark</w:t>
-      </w:r>
-      <w:bookmarkEnd w:id="39"/>
-    </w:p>
-    <w:p>
-      <w:pPr>
-        <w:pStyle w:val="FirstParagraph"/>
-      </w:pPr>
-      <w:r>
-        <w:t xml:space="preserve">Features were 226 binary indicators per genome: AMRFinderPlus gene families (allele suffixes</w:t>
-      </w:r>
-      <w:r>
-        <w:t xml:space="preserve"> </w:t>
-      </w:r>
-      <w:r>
-        <w:t xml:space="preserve">collapsed, OXA-48-like kept distinct from other OXA enzymes), 100 point-mutation calls, 33</w:t>
-      </w:r>
-      <w:r>
-        <w:t xml:space="preserve"> </w:t>
-      </w:r>
-      <w:r>
-        <w:t xml:space="preserve">AMRFinderPlus functional subclasses, and two</w:t>
-      </w:r>
-      <w:r>
-        <w:t xml:space="preserve"> </w:t>
-      </w:r>
-      <w:r>
-        <w:rPr>
-          <w:i/>
-        </w:rPr>
-        <w:t xml:space="preserve">mgrB</w:t>
-      </w:r>
-      <w:r>
-        <w:t xml:space="preserve"> </w:t>
-      </w:r>
-      <w:r>
-        <w:t xml:space="preserve">features. Features present in fewer than five</w:t>
-      </w:r>
-      <w:r>
-        <w:t xml:space="preserve"> </w:t>
-      </w:r>
-      <w:r>
-        <w:t xml:space="preserve">genomes were dropped.</w:t>
-      </w:r>
-    </w:p>
-    <w:p>
-      <w:pPr>
-        <w:pStyle w:val="BodyText"/>
-      </w:pPr>
-      <w:r>
-        <w:t xml:space="preserve">Three predictors were compared: the per-drug rule (for colistin including mechanism-specified</w:t>
-      </w:r>
-      <w:r>
-        <w:t xml:space="preserve"> </w:t>
-      </w:r>
-      <w:r>
-        <w:rPr>
-          <w:i/>
-        </w:rPr>
-        <w:t xml:space="preserve">mgrB</w:t>
-      </w:r>
-      <w:r>
-        <w:t xml:space="preserve"> </w:t>
-      </w:r>
-      <w:r>
-        <w:t xml:space="preserve">disruption, but not the missense tier, for the reason given in Section 3.5); L2 logistic regression [15]</w:t>
-      </w:r>
-      <w:r>
-        <w:t xml:space="preserve"> </w:t>
-      </w:r>
-      <w:r>
-        <w:t xml:space="preserve">(C = 1, class-balanced); and gradient boosting (HistGradientBoostingClassifier, 200 iterations, 15</w:t>
-      </w:r>
-      <w:r>
-        <w:t xml:space="preserve"> </w:t>
-      </w:r>
-      <w:r>
-        <w:t xml:space="preserve">leaves, class-balanced). Hyperparameters were fixed rather than tuned, since the object of study is</w:t>
-      </w:r>
-      <w:r>
-        <w:t xml:space="preserve"> </w:t>
-      </w:r>
-      <w:r>
-        <w:t xml:space="preserve">validation design rather than peak performance.</w:t>
-      </w:r>
-    </w:p>
-    <w:p>
-      <w:pPr>
-        <w:pStyle w:val="BodyText"/>
-      </w:pPr>
-      <w:r>
-        <w:t xml:space="preserve">Four split schemes were used: random 5-fold; study-aware 5-fold grouped by BioProject;</w:t>
-      </w:r>
-      <w:r>
-        <w:t xml:space="preserve"> </w:t>
-      </w:r>
-      <w:r>
-        <w:t xml:space="preserve">lineage-aware 5-fold grouped by sequence type; and temporal. Genomes with missing group metadata</w:t>
-      </w:r>
-      <w:r>
-        <w:t xml:space="preserve"> </w:t>
-      </w:r>
-      <w:r>
-        <w:t xml:space="preserve">were assigned singleton groups so absent metadata can never merge unrelated isolates. Metrics are</w:t>
-      </w:r>
-      <w:r>
-        <w:t xml:space="preserve"> </w:t>
-      </w:r>
-      <w:r>
-        <w:t xml:space="preserve">computed on pooled held-out predictions with 95% Wilson intervals [16], reported both on all test labels</w:t>
-      </w:r>
-      <w:r>
-        <w:t xml:space="preserve"> </w:t>
-      </w:r>
-      <w:r>
-        <w:t xml:space="preserve">and with borderline-MIC labels removed. A split is scored only if its test set contains at least 10</w:t>
-      </w:r>
-      <w:r>
-        <w:t xml:space="preserve"> </w:t>
-      </w:r>
-      <w:r>
-        <w:t xml:space="preserve">resistant and 10 susceptible genomes. Differences between predictors were assessed by paired</w:t>
-      </w:r>
-      <w:r>
-        <w:t xml:space="preserve"> </w:t>
-      </w:r>
-      <w:r>
-        <w:t xml:space="preserve">bootstrap over held-out genomes (2,000 resamples), resampling once per iteration and recomputing</w:t>
-      </w:r>
-      <w:r>
-        <w:t xml:space="preserve"> </w:t>
-      </w:r>
-      <w:r>
-        <w:t xml:space="preserve">both predictors on the same resampled set.</w:t>
-      </w:r>
-    </w:p>
-    <w:p>
-      <w:pPr>
-        <w:pStyle w:val="BodyText"/>
-      </w:pPr>
-      <w:r>
-        <w:t xml:space="preserve">Comparing every drug, split scheme and predictor pair yields a family of 54 tests, not one, so some</w:t>
-      </w:r>
-      <w:r>
-        <w:t xml:space="preserve"> </w:t>
-      </w:r>
-      <w:r>
-        <w:t xml:space="preserve">intervals will exclude zero by chance. Each comparison therefore also carries a two-sided bootstrap</w:t>
-      </w:r>
-      <w:r>
-        <w:t xml:space="preserve"> </w:t>
-      </w:r>
-      <w:r>
-        <w:t xml:space="preserve">p-value, floored at 1/2,000 since no finer resolution exists, and a Benjamini–Hochberg [17] q-value</w:t>
-      </w:r>
-      <w:r>
-        <w:t xml:space="preserve"> </w:t>
-      </w:r>
-      <w:r>
-        <w:t xml:space="preserve">computed across the whole family. Benjamini–Hochberg is our primary correction: the comparisons</w:t>
-      </w:r>
-      <w:r>
-        <w:t xml:space="preserve"> </w:t>
-      </w:r>
-      <w:r>
-        <w:t xml:space="preserve">share predictors, genomes and folds and are therefore positively dependent, and controlling the</w:t>
-      </w:r>
-      <w:r>
-        <w:t xml:space="preserve"> </w:t>
-      </w:r>
-      <w:r>
-        <w:t xml:space="preserve">false discovery rate is the appropriate goal for a benchmark mapping where differences exist rather</w:t>
-      </w:r>
-      <w:r>
-        <w:t xml:space="preserve"> </w:t>
-      </w:r>
-      <w:r>
-        <w:t xml:space="preserve">than testing a single hypothesis. We also report which comparisons survive the far stricter</w:t>
-      </w:r>
-      <w:r>
-        <w:t xml:space="preserve"> </w:t>
-      </w:r>
-      <w:r>
-        <w:t xml:space="preserve">Bonferroni threshold (p &lt; 0.00093), and we treat only those as established beyond doubt.</w:t>
-      </w:r>
-    </w:p>
-    <w:p>
-      <w:pPr>
-        <w:pStyle w:val="Heading3"/>
-      </w:pPr>
-      <w:bookmarkStart w:id="40" w:name="external-validation"/>
-      <w:r>
-        <w:t xml:space="preserve">2.10 External validation</w:t>
-      </w:r>
-      <w:bookmarkEnd w:id="40"/>
-    </w:p>
-    <w:p>
-      <w:pPr>
-        <w:pStyle w:val="FirstParagraph"/>
-      </w:pPr>
-      <w:r>
-        <w:t xml:space="preserve">Leave-one-study-out within BV-BRC holds out a study but not an aggregator: every such study was</w:t>
-      </w:r>
-      <w:r>
-        <w:t xml:space="preserve"> </w:t>
-      </w:r>
-      <w:r>
-        <w:t xml:space="preserve">curated the same way and was available to us when the rule was specified. To test the rule on</w:t>
-      </w:r>
-      <w:r>
-        <w:t xml:space="preserve"> </w:t>
-      </w:r>
-      <w:r>
-        <w:t xml:space="preserve">genomes whose phenotypes we had no access to, we assembled a cohort from NCBI Pathogen Detection,</w:t>
-      </w:r>
-      <w:r>
-        <w:t xml:space="preserve"> </w:t>
-      </w:r>
-      <w:r>
-        <w:t xml:space="preserve">joining submitted antimicrobial susceptibility results (</w:t>
-      </w:r>
-      <w:r>
-        <w:rPr>
-          <w:rStyle w:val="VerbatimChar"/>
-        </w:rPr>
-        <w:t xml:space="preserve">pdbrowser.ast</w:t>
-      </w:r>
-      <w:r>
-        <w:t xml:space="preserve">) to isolate records</w:t>
-      </w:r>
-      <w:r>
-        <w:t xml:space="preserve"> </w:t>
-      </w:r>
-      <w:r>
-        <w:t xml:space="preserve">(</w:t>
-      </w:r>
-      <w:r>
-        <w:rPr>
-          <w:rStyle w:val="VerbatimChar"/>
-        </w:rPr>
-        <w:t xml:space="preserve">pdbrowser.isolates</w:t>
-      </w:r>
-      <w:r>
-        <w:t xml:space="preserve">) for the assembly accession, since neither table carries both the MIC and</w:t>
-      </w:r>
-      <w:r>
-        <w:t xml:space="preserve"> </w:t>
-      </w:r>
-      <w:r>
-        <w:t xml:space="preserve">the accession. All</w:t>
-      </w:r>
-      <w:r>
-        <w:t xml:space="preserve"> </w:t>
-      </w:r>
-      <w:r>
-        <w:rPr>
-          <w:i/>
-        </w:rPr>
-        <w:t xml:space="preserve">K. pneumoniae</w:t>
-      </w:r>
-      <w:r>
-        <w:t xml:space="preserve"> </w:t>
-      </w:r>
-      <w:r>
-        <w:t xml:space="preserve">colistin results with an assembly accession were</w:t>
-      </w:r>
-      <w:r>
-        <w:t xml:space="preserve"> </w:t>
-      </w:r>
-      <w:r>
-        <w:t xml:space="preserve">retrieved.</w:t>
-      </w:r>
-    </w:p>
-    <w:p>
-      <w:pPr>
-        <w:pStyle w:val="BodyText"/>
-      </w:pPr>
-      <w:r>
-        <w:t xml:space="preserve">Because BV-BRC ingests from NCBI, overlap was removed before anything else: isolates matching our</w:t>
-      </w:r>
-      <w:r>
-        <w:t xml:space="preserve"> </w:t>
-      </w:r>
-      <w:r>
-        <w:t xml:space="preserve">cohort by BioSample accession, or by assembly accession ignoring the version suffix, were excluded.</w:t>
-      </w:r>
-      <w:r>
-        <w:t xml:space="preserve"> </w:t>
-      </w:r>
-      <w:r>
-        <w:t xml:space="preserve">Labels were re-derived from the submitted MIC under the same pinned EUCAST table used internally,</w:t>
-      </w:r>
-      <w:r>
-        <w:t xml:space="preserve"> </w:t>
-      </w:r>
-      <w:r>
-        <w:t xml:space="preserve">never taken from the submitted phenotype; isolates without a usable MIC were retained as a separate</w:t>
-      </w:r>
-      <w:r>
-        <w:t xml:space="preserve"> </w:t>
-      </w:r>
-      <w:r>
-        <w:t xml:space="preserve">stratum carrying the submitter’s own interpretation. Assemblies were downloaded from NCBI Datasets</w:t>
-      </w:r>
-      <w:r>
-        <w:t xml:space="preserve"> </w:t>
-      </w:r>
-      <w:r>
-        <w:t xml:space="preserve">and verified against each archive’s md5. AMRFinderPlus and Kleborate were run through the identical</w:t>
-      </w:r>
-      <w:r>
-        <w:t xml:space="preserve"> </w:t>
-      </w:r>
-      <w:r>
-        <w:t xml:space="preserve">pipeline code as the internal cohort, and the rules were imported unchanged from the analysis</w:t>
-      </w:r>
-      <w:r>
-        <w:t xml:space="preserve"> </w:t>
-      </w:r>
-      <w:r>
-        <w:t xml:space="preserve">module. Nothing was refitted, reselected or thresholded for this cohort, and the evaluation exposes</w:t>
-      </w:r>
-      <w:r>
-        <w:t xml:space="preserve"> </w:t>
-      </w:r>
-      <w:r>
-        <w:t xml:space="preserve">no parameter that could be.</w:t>
-      </w:r>
-    </w:p>
-    <w:p>
-      <w:pPr>
-        <w:pStyle w:val="Heading3"/>
-      </w:pPr>
-      <w:bookmarkStart w:id="41" w:name="reproducibility"/>
-      <w:r>
-        <w:t xml:space="preserve">2.11 Reproducibility</w:t>
-      </w:r>
-      <w:bookmarkEnd w:id="41"/>
-    </w:p>
-    <w:p>
-      <w:pPr>
-        <w:pStyle w:val="FirstParagraph"/>
-      </w:pPr>
-      <w:r>
-        <w:t xml:space="preserve">All analyses are deterministic for a fixed seed (20261024). Code, pinned environments, manifests,</w:t>
-      </w:r>
-      <w:r>
-        <w:t xml:space="preserve"> </w:t>
-      </w:r>
-      <w:r>
-        <w:t xml:space="preserve">decision records, reports and figures are at</w:t>
-      </w:r>
-      <w:r>
-        <w:t xml:space="preserve"> </w:t>
-      </w:r>
-      <w:hyperlink r:id="rId27">
-        <w:r>
-          <w:rPr>
-            <w:rStyle w:val="Hyperlink"/>
-          </w:rPr>
-          <w:t xml:space="preserve">https://github.com/omarfaruqe/klebsiella-amr</w:t>
-        </w:r>
-      </w:hyperlink>
-      <w:r>
-        <w:t xml:space="preserve">.</w:t>
-      </w:r>
-    </w:p>
-    <w:p>
-      <w:pPr>
-        <w:pStyle w:val="Heading2"/>
-      </w:pPr>
-      <w:bookmarkStart w:id="42" w:name="results"/>
-      <w:r>
-        <w:t xml:space="preserve">3. Results</w:t>
-      </w:r>
-      <w:bookmarkEnd w:id="42"/>
-    </w:p>
-    <w:p>
-      <w:pPr>
-        <w:pStyle w:val="Heading3"/>
-      </w:pPr>
-      <w:bookmarkStart w:id="43" w:name="cohort"/>
-      <w:r>
-        <w:t xml:space="preserve">3.1 Cohort</w:t>
-      </w:r>
-      <w:bookmarkEnd w:id="43"/>
-    </w:p>
-    <w:p>
-      <w:pPr>
-        <w:pStyle w:val="FirstParagraph"/>
-      </w:pPr>
-      <w:r>
         <w:t xml:space="preserve">Of 6,817 labelled genomes, 6,652 passed quality control. Requiring agreement between the species</w:t>
       </w:r>
       <w:r>
@@ -2566,28 +2450,7 @@
         <w:t xml:space="preserve"> </w:t>
       </w:r>
       <w:r>
-        <w:t xml:space="preserve">6,652 completed both genotyping tools (8.8 h wall time, ~140 CPU-hours, zero failures), and the</w:t>
-      </w:r>
-      <w:r>
-        <w:t xml:space="preserve"> </w:t>
-      </w:r>
-      <w:r>
-        <w:t xml:space="preserve">targeted</w:t>
-      </w:r>
-      <w:r>
-        <w:t xml:space="preserve"> </w:t>
-      </w:r>
-      <w:r>
-        <w:rPr>
-          <w:i/>
-        </w:rPr>
-        <w:t xml:space="preserve">mgrB</w:t>
-      </w:r>
-      <w:r>
-        <w:t xml:space="preserve"> </w:t>
-      </w:r>
-      <w:r>
-        <w:t xml:space="preserve">search took 2 minutes for 6,652 assemblies on 16 threads.</w:t>
+        <w:t xml:space="preserve">6,652 completed both genotyping tools without failure.</w:t>
       </w:r>
     </w:p>
     <w:p>
@@ -5904,19 +5767,13 @@
         <w:t xml:space="preserve"> </w:t>
       </w:r>
       <w:r>
-        <w:t xml:space="preserve">design. Predictive values across a range of prevalences are tabulated in</w:t>
-      </w:r>
-      <w:r>
-        <w:t xml:space="preserve"> </w:t>
-      </w:r>
-      <w:r>
-        <w:rPr>
-          <w:rStyle w:val="VerbatimChar"/>
-        </w:rPr>
-        <w:t xml:space="preserve">reports/review/predictive_values.md</w:t>
-      </w:r>
-      <w:r>
-        <w:t xml:space="preserve">.</w:t>
+        <w:t xml:space="preserve">design. Predictive values across a range of plausible prevalences are given in Supplementary</w:t>
+      </w:r>
+      <w:r>
+        <w:t xml:space="preserve"> </w:t>
+      </w:r>
+      <w:r>
+        <w:t xml:space="preserve">Table S4.</w:t>
       </w:r>
     </w:p>
     <w:p>
@@ -6343,14 +6200,6 @@
         <w:t xml:space="preserve">9. References</w:t>
       </w:r>
       <w:bookmarkEnd w:id="63"/>
-    </w:p>
-    <w:p>
-      <w:pPr>
-        <w:pStyle w:val="FirstParagraph"/>
-      </w:pPr>
-      <w:r>
-        <w:t xml:space="preserve">All references were verified against the publisher record during preparation (references 1–6 on 2026-10-24, references 7–9 on 2026-10-25).</w:t>
-      </w:r>
     </w:p>
     <w:p>
       <w:pPr>

</xml_diff>